<commit_message>
Updating failing to generate cv problem
</commit_message>
<xml_diff>
--- a/templates/template_professional.docx
+++ b/templates/template_professional.docx
@@ -157,6 +157,17 @@
         </w:rPr>
         <w:t>{#skills}</w:t>
       </w:r>
+    </w:p>
+    <w:p>
+      <w:pPr>
+        <w:spacing w:before="200" w:after="0" w:line="22" w:lineRule="atLeast"/>
+        <w:rPr>
+          <w:rFonts w:cs="Segoe UI"/>
+          <w:color w:val="1A2634"/>
+          <w:sz w:val="21"/>
+          <w:szCs w:val="21"/>
+        </w:rPr>
+      </w:pPr>
       <w:r>
         <w:rPr>
           <w:rFonts w:cs="Segoe UI"/>
@@ -164,9 +175,19 @@
           <w:sz w:val="21"/>
           <w:szCs w:val="21"/>
         </w:rPr>
-        <w:br/>
         <w:t>• {.}</w:t>
       </w:r>
+    </w:p>
+    <w:p>
+      <w:pPr>
+        <w:spacing w:after="0" w:line="22" w:lineRule="atLeast"/>
+        <w:rPr>
+          <w:rFonts w:cs="Segoe UI"/>
+          <w:color w:val="1A2634"/>
+          <w:sz w:val="21"/>
+          <w:szCs w:val="21"/>
+        </w:rPr>
+      </w:pPr>
       <w:r>
         <w:rPr>
           <w:rFonts w:cs="Segoe UI"/>
@@ -174,7 +195,6 @@
           <w:sz w:val="21"/>
           <w:szCs w:val="21"/>
         </w:rPr>
-        <w:br/>
         <w:t>{/skills}</w:t>
       </w:r>
       <w:r>
@@ -190,7 +210,7 @@
     </w:p>
     <w:p>
       <w:pPr>
-        <w:spacing w:after="0" w:line="22" w:lineRule="atLeast"/>
+        <w:spacing w:before="200" w:after="0" w:line="22" w:lineRule="atLeast"/>
         <w:rPr>
           <w:rFonts w:cs="Segoe UI"/>
           <w:color w:val="1A2634"/>
@@ -918,6 +938,7 @@
           <w:sz w:val="21"/>
           <w:szCs w:val="21"/>
         </w:rPr>
+        <w:lastRenderedPageBreak/>
         <w:t>{/</w:t>
       </w:r>
       <w:proofErr w:type="spellStart"/>
@@ -958,7 +979,6 @@
           <w:sz w:val="21"/>
           <w:szCs w:val="21"/>
         </w:rPr>
-        <w:lastRenderedPageBreak/>
         <w:t>{/projects}</w:t>
       </w:r>
     </w:p>
@@ -1376,12 +1396,6 @@
     <w:p>
       <w:pPr>
         <w:spacing w:after="60" w:line="22" w:lineRule="atLeast"/>
-        <w:rPr>
-          <w:rFonts w:cs="Segoe UI"/>
-          <w:color w:val="1A2634"/>
-          <w:sz w:val="21"/>
-          <w:szCs w:val="21"/>
-        </w:rPr>
       </w:pPr>
       <w:r>
         <w:rPr>
@@ -1562,7 +1576,7 @@
     </w:p>
     <w:p>
       <w:pPr>
-        <w:spacing w:after="60" w:line="22" w:lineRule="atLeast"/>
+        <w:spacing w:before="200" w:after="60" w:line="22" w:lineRule="atLeast"/>
         <w:rPr>
           <w:rFonts w:cs="Segoe UI"/>
           <w:color w:val="1A2634"/>
@@ -1742,7 +1756,7 @@
     </w:p>
     <w:p>
       <w:pPr>
-        <w:spacing w:after="0" w:line="22" w:lineRule="atLeast"/>
+        <w:spacing w:before="200" w:after="0" w:line="22" w:lineRule="atLeast"/>
         <w:rPr>
           <w:rFonts w:cs="Segoe UI"/>
           <w:color w:val="1A2634"/>
@@ -1820,7 +1834,7 @@
     </w:p>
     <w:p>
       <w:pPr>
-        <w:spacing w:after="60" w:line="22" w:lineRule="atLeast"/>
+        <w:spacing w:before="200" w:after="60" w:line="22" w:lineRule="atLeast"/>
         <w:rPr>
           <w:rFonts w:cs="Segoe UI"/>
           <w:color w:val="1A2634"/>

</xml_diff>

<commit_message>
Fix CV template selection logic and cleanup unused helpers
</commit_message>
<xml_diff>
--- a/templates/template_professional.docx
+++ b/templates/template_professional.docx
@@ -197,46 +197,357 @@
         <w:spacing w:before="200" w:after="120"/>
       </w:pPr>
       <w:r>
+        <w:t>{#HAS_EXPERIENCE}</w:t>
+      </w:r>
+    </w:p>
+    <w:p>
+      <w:pPr>
+        <w:pBdr>
+          <w:bottom w:val="single" w:sz="8" w:space="1" w:color="auto"/>
+        </w:pBdr>
+        <w:spacing w:before="200" w:after="120"/>
+        <w:rPr>
+          <w:rFonts w:cs="Segoe UI"/>
+          <w:b/>
+          <w:bCs/>
+          <w:color w:val="1A2634"/>
+          <w:sz w:val="24"/>
+          <w:szCs w:val="24"/>
+        </w:rPr>
+      </w:pPr>
+      <w:r>
+        <w:rPr>
+          <w:rFonts w:cs="Segoe UI"/>
+          <w:b/>
+          <w:bCs/>
+          <w:color w:val="1A2634"/>
+          <w:sz w:val="24"/>
+          <w:szCs w:val="24"/>
+        </w:rPr>
+        <w:t>PROFESSIONAL EXPERIENCE</w:t>
+      </w:r>
+    </w:p>
+    <w:p>
+      <w:pPr>
+        <w:spacing w:before="200" w:after="60" w:line="22" w:lineRule="atLeast"/>
+      </w:pPr>
+      <w:r>
+        <w:t>{/HAS_EXPERIENCE}</w:t>
+      </w:r>
+      <w:r>
+        <w:br/>
+      </w:r>
+      <w:r>
+        <w:br/>
         <w:t>{#experience}</w:t>
       </w:r>
     </w:p>
     <w:p>
       <w:pPr>
+        <w:spacing w:before="200" w:after="60" w:line="22" w:lineRule="atLeast"/>
+        <w:rPr>
+          <w:rFonts w:cs="Segoe UI"/>
+          <w:b/>
+          <w:bCs/>
+          <w:color w:val="1A2634"/>
+          <w:sz w:val="21"/>
+          <w:szCs w:val="21"/>
+        </w:rPr>
+      </w:pPr>
+      <w:r>
+        <w:rPr>
+          <w:rFonts w:cs="Segoe UI"/>
+          <w:b/>
+          <w:bCs/>
+          <w:color w:val="1A2634"/>
+          <w:sz w:val="21"/>
+          <w:szCs w:val="21"/>
+        </w:rPr>
+        <w:t>{title}</w:t>
+      </w:r>
+    </w:p>
+    <w:p>
+      <w:pPr>
+        <w:spacing w:after="60" w:line="22" w:lineRule="atLeast"/>
+        <w:rPr>
+          <w:rFonts w:cs="Segoe UI"/>
+          <w:color w:val="1A2634"/>
+          <w:sz w:val="21"/>
+          <w:szCs w:val="21"/>
+        </w:rPr>
+      </w:pPr>
+      <w:r>
+        <w:rPr>
+          <w:rFonts w:cs="Segoe UI"/>
+          <w:b/>
+          <w:bCs/>
+          <w:color w:val="1A2634"/>
+          <w:sz w:val="21"/>
+          <w:szCs w:val="21"/>
+        </w:rPr>
+        <w:t>{company}</w:t>
+      </w:r>
+      <w:r>
+        <w:rPr>
+          <w:rFonts w:cs="Segoe UI"/>
+          <w:color w:val="1A2634"/>
+          <w:sz w:val="21"/>
+          <w:szCs w:val="21"/>
+        </w:rPr>
+        <w:t>{#location}</w:t>
+      </w:r>
+      <w:r>
+        <w:rPr>
+          <w:rFonts w:cs="Segoe UI"/>
+          <w:color w:val="1A2634"/>
+          <w:sz w:val="21"/>
+          <w:szCs w:val="21"/>
+        </w:rPr>
+        <w:t xml:space="preserve"> |</w:t>
+      </w:r>
+      <w:r>
+        <w:rPr>
+          <w:rFonts w:cs="Segoe UI"/>
+          <w:color w:val="1A2634"/>
+          <w:sz w:val="21"/>
+          <w:szCs w:val="21"/>
+        </w:rPr>
+        <w:t xml:space="preserve"> {location}{/location}</w:t>
+      </w:r>
+    </w:p>
+    <w:p>
+      <w:pPr>
+        <w:spacing w:after="60" w:line="22" w:lineRule="atLeast"/>
+        <w:rPr>
+          <w:rFonts w:cs="Segoe UI"/>
+          <w:color w:val="1A2634"/>
+          <w:sz w:val="21"/>
+          <w:szCs w:val="21"/>
+        </w:rPr>
+      </w:pPr>
+      <w:r>
+        <w:rPr>
+          <w:rFonts w:cs="Segoe UI"/>
+          <w:color w:val="1A2634"/>
+          <w:sz w:val="21"/>
+          <w:szCs w:val="21"/>
+        </w:rPr>
+        <w:t>{start} – {end}</w:t>
+      </w:r>
+    </w:p>
+    <w:p>
+      <w:pPr>
+        <w:spacing w:after="60" w:line="22" w:lineRule="atLeast"/>
+        <w:rPr>
+          <w:rFonts w:cs="Segoe UI"/>
+          <w:color w:val="1A2634"/>
+          <w:sz w:val="21"/>
+          <w:szCs w:val="21"/>
+        </w:rPr>
+      </w:pPr>
+      <w:r>
+        <w:rPr>
+          <w:rFonts w:cs="Segoe UI"/>
+          <w:color w:val="1A2634"/>
+          <w:sz w:val="21"/>
+          <w:szCs w:val="21"/>
+        </w:rPr>
+        <w:t>{#role_summary}</w:t>
+      </w:r>
+    </w:p>
+    <w:p>
+      <w:pPr>
+        <w:spacing w:after="60" w:line="22" w:lineRule="atLeast"/>
+        <w:rPr>
+          <w:rFonts w:cs="Segoe UI"/>
+          <w:color w:val="1A2634"/>
+          <w:sz w:val="21"/>
+          <w:szCs w:val="21"/>
+        </w:rPr>
+      </w:pPr>
+      <w:r>
+        <w:rPr>
+          <w:rFonts w:cs="Segoe UI"/>
+          <w:color w:val="1A2634"/>
+          <w:sz w:val="21"/>
+          <w:szCs w:val="21"/>
+        </w:rPr>
+        <w:t>{</w:t>
+      </w:r>
+      <w:proofErr w:type="spellStart"/>
+      <w:r>
+        <w:rPr>
+          <w:rFonts w:cs="Segoe UI"/>
+          <w:color w:val="1A2634"/>
+          <w:sz w:val="21"/>
+          <w:szCs w:val="21"/>
+        </w:rPr>
+        <w:t>role_summary</w:t>
+      </w:r>
+      <w:proofErr w:type="spellEnd"/>
+      <w:r>
+        <w:rPr>
+          <w:rFonts w:cs="Segoe UI"/>
+          <w:color w:val="1A2634"/>
+          <w:sz w:val="21"/>
+          <w:szCs w:val="21"/>
+        </w:rPr>
+        <w:t>}</w:t>
+      </w:r>
+    </w:p>
+    <w:p>
+      <w:pPr>
+        <w:spacing w:after="60" w:line="22" w:lineRule="atLeast"/>
+        <w:rPr>
+          <w:rFonts w:cs="Segoe UI"/>
+          <w:color w:val="1A2634"/>
+          <w:sz w:val="21"/>
+          <w:szCs w:val="21"/>
+        </w:rPr>
+      </w:pPr>
+      <w:r>
+        <w:rPr>
+          <w:rFonts w:cs="Segoe UI"/>
+          <w:color w:val="1A2634"/>
+          <w:sz w:val="21"/>
+          <w:szCs w:val="21"/>
+        </w:rPr>
+        <w:t>{/</w:t>
+      </w:r>
+      <w:proofErr w:type="spellStart"/>
+      <w:r>
+        <w:rPr>
+          <w:rFonts w:cs="Segoe UI"/>
+          <w:color w:val="1A2634"/>
+          <w:sz w:val="21"/>
+          <w:szCs w:val="21"/>
+        </w:rPr>
+        <w:t>role_summary</w:t>
+      </w:r>
+      <w:proofErr w:type="spellEnd"/>
+      <w:r>
+        <w:rPr>
+          <w:rFonts w:cs="Segoe UI"/>
+          <w:color w:val="1A2634"/>
+          <w:sz w:val="21"/>
+          <w:szCs w:val="21"/>
+        </w:rPr>
+        <w:t>}</w:t>
+      </w:r>
+    </w:p>
+    <w:p>
+      <w:pPr>
+        <w:spacing w:after="60" w:line="22" w:lineRule="atLeast"/>
+        <w:rPr>
+          <w:rFonts w:cs="Segoe UI"/>
+          <w:color w:val="1A2634"/>
+          <w:sz w:val="21"/>
+          <w:szCs w:val="21"/>
+        </w:rPr>
+      </w:pPr>
+      <w:r>
+        <w:rPr>
+          <w:rFonts w:cs="Segoe UI"/>
+          <w:color w:val="1A2634"/>
+          <w:sz w:val="21"/>
+          <w:szCs w:val="21"/>
+        </w:rPr>
+        <w:t>{#tasks}</w:t>
+      </w:r>
+    </w:p>
+    <w:p>
+      <w:pPr>
+        <w:spacing w:after="60" w:line="22" w:lineRule="atLeast"/>
+        <w:rPr>
+          <w:rFonts w:cs="Segoe UI"/>
+          <w:color w:val="1A2634"/>
+          <w:sz w:val="21"/>
+          <w:szCs w:val="21"/>
+        </w:rPr>
+      </w:pPr>
+      <w:r>
+        <w:rPr>
+          <w:rFonts w:cs="Segoe UI"/>
+          <w:color w:val="1A2634"/>
+          <w:sz w:val="24"/>
+          <w:szCs w:val="24"/>
+        </w:rPr>
+        <w:t>•</w:t>
+      </w:r>
+      <w:r>
+        <w:rPr>
+          <w:rFonts w:cs="Segoe UI"/>
+          <w:color w:val="1A2634"/>
+          <w:sz w:val="21"/>
+          <w:szCs w:val="21"/>
+        </w:rPr>
+        <w:t xml:space="preserve"> {.}</w:t>
+      </w:r>
+    </w:p>
+    <w:p>
+      <w:pPr>
+        <w:spacing w:after="60" w:line="22" w:lineRule="atLeast"/>
+        <w:rPr>
+          <w:rFonts w:cs="Segoe UI"/>
+          <w:color w:val="1A2634"/>
+          <w:sz w:val="21"/>
+          <w:szCs w:val="21"/>
+        </w:rPr>
+      </w:pPr>
+      <w:r>
+        <w:rPr>
+          <w:rFonts w:cs="Segoe UI"/>
+          <w:color w:val="1A2634"/>
+          <w:sz w:val="21"/>
+          <w:szCs w:val="21"/>
+        </w:rPr>
+        <w:t>{/tasks}</w:t>
+      </w:r>
+    </w:p>
+    <w:p>
+      <w:pPr>
+        <w:spacing w:after="0" w:line="22" w:lineRule="atLeast"/>
+        <w:rPr>
+          <w:rFonts w:cs="Segoe UI"/>
+          <w:color w:val="1A2634"/>
+          <w:sz w:val="21"/>
+          <w:szCs w:val="21"/>
+        </w:rPr>
+      </w:pPr>
+      <w:r>
+        <w:rPr>
+          <w:rFonts w:cs="Segoe UI"/>
+          <w:color w:val="1A2634"/>
+          <w:sz w:val="21"/>
+          <w:szCs w:val="21"/>
+        </w:rPr>
+        <w:t>{/experience}</w:t>
+      </w:r>
+    </w:p>
+    <w:p>
+      <w:pPr>
         <w:pBdr>
           <w:bottom w:val="single" w:sz="8" w:space="1" w:color="auto"/>
         </w:pBdr>
         <w:spacing w:before="200" w:after="120"/>
-        <w:rPr>
-          <w:rFonts w:cs="Segoe UI"/>
-          <w:b/>
-          <w:bCs/>
-          <w:color w:val="1A2634"/>
-          <w:sz w:val="24"/>
-          <w:szCs w:val="24"/>
-        </w:rPr>
       </w:pPr>
       <w:r>
-        <w:rPr>
-          <w:rFonts w:cs="Segoe UI"/>
-          <w:b/>
-          <w:bCs/>
-          <w:color w:val="1A2634"/>
-          <w:sz w:val="24"/>
-          <w:szCs w:val="24"/>
-        </w:rPr>
-        <w:t>PROFESSIONAL EXPERIENCE</w:t>
+        <w:t>{#HAS_PROJECTS}</w:t>
       </w:r>
     </w:p>
     <w:p>
       <w:pPr>
-        <w:spacing w:before="200" w:after="60" w:line="22" w:lineRule="atLeast"/>
+        <w:pBdr>
+          <w:bottom w:val="single" w:sz="8" w:space="1" w:color="auto"/>
+        </w:pBdr>
+        <w:spacing w:before="200" w:after="120"/>
         <w:rPr>
           <w:rFonts w:cs="Segoe UI"/>
           <w:b/>
           <w:bCs/>
           <w:color w:val="1A2634"/>
-          <w:sz w:val="21"/>
-          <w:szCs w:val="21"/>
+          <w:sz w:val="24"/>
+          <w:szCs w:val="24"/>
         </w:rPr>
       </w:pPr>
       <w:r>
@@ -245,15 +556,23 @@
           <w:b/>
           <w:bCs/>
           <w:color w:val="1A2634"/>
-          <w:sz w:val="21"/>
-          <w:szCs w:val="21"/>
-        </w:rPr>
-        <w:t>{title}</w:t>
+          <w:sz w:val="24"/>
+          <w:szCs w:val="24"/>
+        </w:rPr>
+        <w:t>PROJECTS</w:t>
       </w:r>
     </w:p>
     <w:p>
       <w:pPr>
         <w:spacing w:after="60" w:line="22" w:lineRule="atLeast"/>
+      </w:pPr>
+      <w:r>
+        <w:t>{/HAS_PROJECTS}</w:t>
+      </w:r>
+    </w:p>
+    <w:p>
+      <w:pPr>
+        <w:spacing w:after="60" w:line="22" w:lineRule="atLeast"/>
         <w:rPr>
           <w:rFonts w:cs="Segoe UI"/>
           <w:color w:val="1A2634"/>
@@ -264,13 +583,397 @@
       <w:r>
         <w:rPr>
           <w:rFonts w:cs="Segoe UI"/>
+          <w:color w:val="1A2634"/>
+          <w:sz w:val="21"/>
+          <w:szCs w:val="21"/>
+        </w:rPr>
+        <w:t>{#projects}</w:t>
+      </w:r>
+    </w:p>
+    <w:p>
+      <w:pPr>
+        <w:spacing w:before="200" w:after="60" w:line="22" w:lineRule="atLeast"/>
+        <w:rPr>
+          <w:rFonts w:cs="Segoe UI"/>
           <w:b/>
           <w:bCs/>
           <w:color w:val="1A2634"/>
           <w:sz w:val="21"/>
           <w:szCs w:val="21"/>
         </w:rPr>
-        <w:t>{company}</w:t>
+      </w:pPr>
+      <w:r>
+        <w:rPr>
+          <w:rFonts w:cs="Segoe UI"/>
+          <w:b/>
+          <w:bCs/>
+          <w:color w:val="1A2634"/>
+          <w:sz w:val="21"/>
+          <w:szCs w:val="21"/>
+        </w:rPr>
+        <w:t>{</w:t>
+      </w:r>
+      <w:proofErr w:type="spellStart"/>
+      <w:r>
+        <w:rPr>
+          <w:rFonts w:cs="Segoe UI"/>
+          <w:b/>
+          <w:bCs/>
+          <w:color w:val="1A2634"/>
+          <w:sz w:val="21"/>
+          <w:szCs w:val="21"/>
+        </w:rPr>
+        <w:t>project_title</w:t>
+      </w:r>
+      <w:proofErr w:type="spellEnd"/>
+      <w:r>
+        <w:rPr>
+          <w:rFonts w:cs="Segoe UI"/>
+          <w:b/>
+          <w:bCs/>
+          <w:color w:val="1A2634"/>
+          <w:sz w:val="21"/>
+          <w:szCs w:val="21"/>
+        </w:rPr>
+        <w:t>}</w:t>
+      </w:r>
+    </w:p>
+    <w:p>
+      <w:pPr>
+        <w:spacing w:after="60" w:line="22" w:lineRule="atLeast"/>
+        <w:rPr>
+          <w:rFonts w:cs="Segoe UI"/>
+          <w:color w:val="1A2634"/>
+          <w:sz w:val="21"/>
+          <w:szCs w:val="21"/>
+        </w:rPr>
+      </w:pPr>
+      <w:r>
+        <w:rPr>
+          <w:rFonts w:cs="Segoe UI"/>
+          <w:color w:val="1A2634"/>
+          <w:sz w:val="21"/>
+          <w:szCs w:val="21"/>
+        </w:rPr>
+        <w:t>{start} – {end}</w:t>
+      </w:r>
+    </w:p>
+    <w:p>
+      <w:pPr>
+        <w:spacing w:after="60" w:line="22" w:lineRule="atLeast"/>
+        <w:rPr>
+          <w:rFonts w:cs="Segoe UI"/>
+          <w:color w:val="1A2634"/>
+          <w:sz w:val="21"/>
+          <w:szCs w:val="21"/>
+        </w:rPr>
+      </w:pPr>
+      <w:r>
+        <w:rPr>
+          <w:rFonts w:cs="Segoe UI"/>
+          <w:color w:val="1A2634"/>
+          <w:sz w:val="21"/>
+          <w:szCs w:val="21"/>
+        </w:rPr>
+        <w:t>{#project_description}</w:t>
+      </w:r>
+    </w:p>
+    <w:p>
+      <w:pPr>
+        <w:spacing w:after="60" w:line="22" w:lineRule="atLeast"/>
+        <w:rPr>
+          <w:rFonts w:cs="Segoe UI"/>
+          <w:color w:val="1A2634"/>
+          <w:sz w:val="21"/>
+          <w:szCs w:val="21"/>
+        </w:rPr>
+      </w:pPr>
+      <w:r>
+        <w:rPr>
+          <w:rFonts w:cs="Segoe UI"/>
+          <w:color w:val="1A2634"/>
+          <w:sz w:val="21"/>
+          <w:szCs w:val="21"/>
+        </w:rPr>
+        <w:t>{</w:t>
+      </w:r>
+      <w:proofErr w:type="spellStart"/>
+      <w:r>
+        <w:rPr>
+          <w:rFonts w:cs="Segoe UI"/>
+          <w:color w:val="1A2634"/>
+          <w:sz w:val="21"/>
+          <w:szCs w:val="21"/>
+        </w:rPr>
+        <w:t>project_description</w:t>
+      </w:r>
+      <w:proofErr w:type="spellEnd"/>
+      <w:r>
+        <w:rPr>
+          <w:rFonts w:cs="Segoe UI"/>
+          <w:color w:val="1A2634"/>
+          <w:sz w:val="21"/>
+          <w:szCs w:val="21"/>
+        </w:rPr>
+        <w:t>}</w:t>
+      </w:r>
+    </w:p>
+    <w:p>
+      <w:pPr>
+        <w:spacing w:after="60" w:line="22" w:lineRule="atLeast"/>
+        <w:rPr>
+          <w:rFonts w:cs="Segoe UI"/>
+          <w:color w:val="1A2634"/>
+          <w:sz w:val="21"/>
+          <w:szCs w:val="21"/>
+        </w:rPr>
+      </w:pPr>
+      <w:r>
+        <w:rPr>
+          <w:rFonts w:cs="Segoe UI"/>
+          <w:color w:val="1A2634"/>
+          <w:sz w:val="21"/>
+          <w:szCs w:val="21"/>
+        </w:rPr>
+        <w:t>{/</w:t>
+      </w:r>
+      <w:proofErr w:type="spellStart"/>
+      <w:r>
+        <w:rPr>
+          <w:rFonts w:cs="Segoe UI"/>
+          <w:color w:val="1A2634"/>
+          <w:sz w:val="21"/>
+          <w:szCs w:val="21"/>
+        </w:rPr>
+        <w:t>project_description</w:t>
+      </w:r>
+      <w:proofErr w:type="spellEnd"/>
+      <w:r>
+        <w:rPr>
+          <w:rFonts w:cs="Segoe UI"/>
+          <w:color w:val="1A2634"/>
+          <w:sz w:val="21"/>
+          <w:szCs w:val="21"/>
+        </w:rPr>
+        <w:t>}</w:t>
+      </w:r>
+    </w:p>
+    <w:p>
+      <w:pPr>
+        <w:spacing w:after="60" w:line="22" w:lineRule="atLeast"/>
+        <w:rPr>
+          <w:rFonts w:cs="Segoe UI"/>
+          <w:color w:val="1A2634"/>
+          <w:sz w:val="21"/>
+          <w:szCs w:val="21"/>
+        </w:rPr>
+      </w:pPr>
+      <w:r>
+        <w:rPr>
+          <w:rFonts w:cs="Segoe UI"/>
+          <w:color w:val="1A2634"/>
+          <w:sz w:val="21"/>
+          <w:szCs w:val="21"/>
+        </w:rPr>
+        <w:t>{#project_tasks}</w:t>
+      </w:r>
+    </w:p>
+    <w:p>
+      <w:pPr>
+        <w:spacing w:after="60" w:line="22" w:lineRule="atLeast"/>
+        <w:rPr>
+          <w:rFonts w:cs="Segoe UI"/>
+          <w:color w:val="1A2634"/>
+          <w:sz w:val="21"/>
+          <w:szCs w:val="21"/>
+        </w:rPr>
+      </w:pPr>
+      <w:r>
+        <w:rPr>
+          <w:rFonts w:cs="Segoe UI"/>
+          <w:color w:val="1A2634"/>
+          <w:sz w:val="24"/>
+          <w:szCs w:val="24"/>
+        </w:rPr>
+        <w:lastRenderedPageBreak/>
+        <w:t>•</w:t>
+      </w:r>
+      <w:r>
+        <w:rPr>
+          <w:rFonts w:cs="Segoe UI"/>
+          <w:color w:val="1A2634"/>
+          <w:sz w:val="21"/>
+          <w:szCs w:val="21"/>
+        </w:rPr>
+        <w:t xml:space="preserve"> {.}</w:t>
+      </w:r>
+    </w:p>
+    <w:p>
+      <w:pPr>
+        <w:spacing w:after="60" w:line="22" w:lineRule="atLeast"/>
+        <w:rPr>
+          <w:rFonts w:cs="Segoe UI"/>
+          <w:color w:val="1A2634"/>
+          <w:sz w:val="21"/>
+          <w:szCs w:val="21"/>
+        </w:rPr>
+      </w:pPr>
+      <w:r>
+        <w:rPr>
+          <w:rFonts w:cs="Segoe UI"/>
+          <w:color w:val="1A2634"/>
+          <w:sz w:val="21"/>
+          <w:szCs w:val="21"/>
+        </w:rPr>
+        <w:t>{/</w:t>
+      </w:r>
+      <w:proofErr w:type="spellStart"/>
+      <w:r>
+        <w:rPr>
+          <w:rFonts w:cs="Segoe UI"/>
+          <w:color w:val="1A2634"/>
+          <w:sz w:val="21"/>
+          <w:szCs w:val="21"/>
+        </w:rPr>
+        <w:t>project_tasks</w:t>
+      </w:r>
+      <w:proofErr w:type="spellEnd"/>
+      <w:r>
+        <w:rPr>
+          <w:rFonts w:cs="Segoe UI"/>
+          <w:color w:val="1A2634"/>
+          <w:sz w:val="21"/>
+          <w:szCs w:val="21"/>
+        </w:rPr>
+        <w:t>}</w:t>
+      </w:r>
+    </w:p>
+    <w:p>
+      <w:pPr>
+        <w:spacing w:after="0" w:line="22" w:lineRule="atLeast"/>
+        <w:rPr>
+          <w:rFonts w:cs="Segoe UI"/>
+          <w:color w:val="1A2634"/>
+          <w:sz w:val="21"/>
+          <w:szCs w:val="21"/>
+        </w:rPr>
+      </w:pPr>
+      <w:r>
+        <w:rPr>
+          <w:rFonts w:cs="Segoe UI"/>
+          <w:color w:val="1A2634"/>
+          <w:sz w:val="21"/>
+          <w:szCs w:val="21"/>
+        </w:rPr>
+        <w:t>{/projects}</w:t>
+      </w:r>
+    </w:p>
+    <w:p>
+      <w:pPr>
+        <w:pBdr>
+          <w:bottom w:val="single" w:sz="8" w:space="1" w:color="auto"/>
+        </w:pBdr>
+        <w:spacing w:before="200" w:after="120"/>
+      </w:pPr>
+      <w:r>
+        <w:t>{#HAS_EDUCATION}</w:t>
+      </w:r>
+    </w:p>
+    <w:p>
+      <w:pPr>
+        <w:pBdr>
+          <w:bottom w:val="single" w:sz="8" w:space="1" w:color="auto"/>
+        </w:pBdr>
+        <w:spacing w:before="200" w:after="120"/>
+        <w:rPr>
+          <w:rFonts w:cs="Segoe UI"/>
+          <w:b/>
+          <w:bCs/>
+          <w:color w:val="1A2634"/>
+          <w:sz w:val="24"/>
+          <w:szCs w:val="24"/>
+        </w:rPr>
+      </w:pPr>
+      <w:r>
+        <w:rPr>
+          <w:rFonts w:cs="Segoe UI"/>
+          <w:b/>
+          <w:bCs/>
+          <w:color w:val="1A2634"/>
+          <w:sz w:val="24"/>
+          <w:szCs w:val="24"/>
+        </w:rPr>
+        <w:t>EDUCATION</w:t>
+      </w:r>
+    </w:p>
+    <w:p>
+      <w:pPr>
+        <w:spacing w:after="60" w:line="22" w:lineRule="atLeast"/>
+      </w:pPr>
+      <w:r>
+        <w:t>{/HAS_EDUCATION}</w:t>
+      </w:r>
+    </w:p>
+    <w:p>
+      <w:pPr>
+        <w:spacing w:after="60" w:line="22" w:lineRule="atLeast"/>
+        <w:rPr>
+          <w:rFonts w:cs="Segoe UI"/>
+          <w:color w:val="1A2634"/>
+          <w:sz w:val="21"/>
+          <w:szCs w:val="21"/>
+        </w:rPr>
+      </w:pPr>
+      <w:r>
+        <w:rPr>
+          <w:rFonts w:cs="Segoe UI"/>
+          <w:color w:val="1A2634"/>
+          <w:sz w:val="21"/>
+          <w:szCs w:val="21"/>
+        </w:rPr>
+        <w:t>{#education}</w:t>
+      </w:r>
+    </w:p>
+    <w:p>
+      <w:pPr>
+        <w:spacing w:before="200" w:after="60" w:line="22" w:lineRule="atLeast"/>
+        <w:rPr>
+          <w:rFonts w:cs="Segoe UI"/>
+          <w:color w:val="1A2634"/>
+          <w:sz w:val="21"/>
+          <w:szCs w:val="21"/>
+        </w:rPr>
+      </w:pPr>
+      <w:r>
+        <w:rPr>
+          <w:rFonts w:cs="Segoe UI"/>
+          <w:color w:val="1A2634"/>
+          <w:sz w:val="21"/>
+          <w:szCs w:val="21"/>
+        </w:rPr>
+        <w:t>{degree}</w:t>
+      </w:r>
+    </w:p>
+    <w:p>
+      <w:pPr>
+        <w:spacing w:after="60" w:line="22" w:lineRule="atLeast"/>
+        <w:rPr>
+          <w:rFonts w:cs="Segoe UI"/>
+          <w:color w:val="1A2634"/>
+          <w:sz w:val="21"/>
+          <w:szCs w:val="21"/>
+        </w:rPr>
+      </w:pPr>
+      <w:r>
+        <w:rPr>
+          <w:rFonts w:cs="Segoe UI"/>
+          <w:b/>
+          <w:bCs/>
+          <w:color w:val="1A2634"/>
+          <w:sz w:val="21"/>
+          <w:szCs w:val="21"/>
+        </w:rPr>
+        <w:t>{school}</w:t>
       </w:r>
       <w:r>
         <w:rPr>
@@ -337,7 +1040,7 @@
           <w:sz w:val="21"/>
           <w:szCs w:val="21"/>
         </w:rPr>
-        <w:t>{#role_summary}</w:t>
+        <w:t>{#edu_detail}</w:t>
       </w:r>
     </w:p>
     <w:p>
@@ -367,7 +1070,7 @@
           <w:sz w:val="21"/>
           <w:szCs w:val="21"/>
         </w:rPr>
-        <w:t>role_summary</w:t>
+        <w:t>edu_detail</w:t>
       </w:r>
       <w:proofErr w:type="spellEnd"/>
       <w:r>
@@ -407,7 +1110,7 @@
           <w:sz w:val="21"/>
           <w:szCs w:val="21"/>
         </w:rPr>
-        <w:t>role_summary</w:t>
+        <w:t>edu_detail</w:t>
       </w:r>
       <w:proofErr w:type="spellEnd"/>
       <w:r>
@@ -422,7 +1125,7 @@
     </w:p>
     <w:p>
       <w:pPr>
-        <w:spacing w:after="60" w:line="22" w:lineRule="atLeast"/>
+        <w:spacing w:after="0" w:line="22" w:lineRule="atLeast"/>
         <w:rPr>
           <w:rFonts w:cs="Segoe UI"/>
           <w:color w:val="1A2634"/>
@@ -437,96 +1140,7 @@
           <w:sz w:val="21"/>
           <w:szCs w:val="21"/>
         </w:rPr>
-        <w:t>{#tasks}</w:t>
-      </w:r>
-    </w:p>
-    <w:p>
-      <w:pPr>
-        <w:spacing w:after="60" w:line="22" w:lineRule="atLeast"/>
-        <w:rPr>
-          <w:rFonts w:cs="Segoe UI"/>
-          <w:color w:val="1A2634"/>
-          <w:sz w:val="21"/>
-          <w:szCs w:val="21"/>
-        </w:rPr>
-      </w:pPr>
-      <w:r>
-        <w:rPr>
-          <w:rFonts w:cs="Segoe UI"/>
-          <w:color w:val="1A2634"/>
-          <w:sz w:val="24"/>
-          <w:szCs w:val="24"/>
-        </w:rPr>
-        <w:t>•</w:t>
-      </w:r>
-      <w:r>
-        <w:rPr>
-          <w:rFonts w:cs="Segoe UI"/>
-          <w:color w:val="1A2634"/>
-          <w:sz w:val="21"/>
-          <w:szCs w:val="21"/>
-        </w:rPr>
-        <w:t xml:space="preserve"> {.}</w:t>
-      </w:r>
-    </w:p>
-    <w:p>
-      <w:pPr>
-        <w:spacing w:after="60" w:line="22" w:lineRule="atLeast"/>
-        <w:rPr>
-          <w:rFonts w:cs="Segoe UI"/>
-          <w:color w:val="1A2634"/>
-          <w:sz w:val="21"/>
-          <w:szCs w:val="21"/>
-        </w:rPr>
-      </w:pPr>
-      <w:r>
-        <w:rPr>
-          <w:rFonts w:cs="Segoe UI"/>
-          <w:color w:val="1A2634"/>
-          <w:sz w:val="21"/>
-          <w:szCs w:val="21"/>
-        </w:rPr>
-        <w:t>{/tasks}</w:t>
-      </w:r>
-    </w:p>
-    <w:p>
-      <w:pPr>
-        <w:spacing w:after="0" w:line="22" w:lineRule="atLeast"/>
-        <w:rPr>
-          <w:rFonts w:cs="Segoe UI"/>
-          <w:color w:val="1A2634"/>
-          <w:sz w:val="21"/>
-          <w:szCs w:val="21"/>
-        </w:rPr>
-      </w:pPr>
-      <w:r>
-        <w:rPr>
-          <w:rFonts w:cs="Segoe UI"/>
-          <w:color w:val="1A2634"/>
-          <w:sz w:val="21"/>
-          <w:szCs w:val="21"/>
-        </w:rPr>
-        <w:t>{/experience}</w:t>
-      </w:r>
-    </w:p>
-    <w:p>
-      <w:pPr>
-        <w:spacing w:before="200" w:after="0" w:line="22" w:lineRule="atLeast"/>
-        <w:rPr>
-          <w:rFonts w:cs="Segoe UI"/>
-          <w:color w:val="1A2634"/>
-          <w:sz w:val="21"/>
-          <w:szCs w:val="21"/>
-        </w:rPr>
-      </w:pPr>
-      <w:r>
-        <w:rPr>
-          <w:rFonts w:cs="Segoe UI"/>
-          <w:color w:val="1A2634"/>
-          <w:sz w:val="21"/>
-          <w:szCs w:val="21"/>
-        </w:rPr>
-        <w:t>{#projects}</w:t>
+        <w:t>{/education}</w:t>
       </w:r>
     </w:p>
     <w:p>
@@ -535,343 +1149,9 @@
           <w:bottom w:val="single" w:sz="8" w:space="1" w:color="auto"/>
         </w:pBdr>
         <w:spacing w:before="200" w:after="120"/>
-        <w:rPr>
-          <w:rFonts w:cs="Segoe UI"/>
-          <w:b/>
-          <w:bCs/>
-          <w:color w:val="1A2634"/>
-          <w:sz w:val="24"/>
-          <w:szCs w:val="24"/>
-        </w:rPr>
       </w:pPr>
       <w:r>
-        <w:rPr>
-          <w:rFonts w:cs="Segoe UI"/>
-          <w:b/>
-          <w:bCs/>
-          <w:color w:val="1A2634"/>
-          <w:sz w:val="24"/>
-          <w:szCs w:val="24"/>
-        </w:rPr>
-        <w:t>PROJECTS</w:t>
-      </w:r>
-    </w:p>
-    <w:p>
-      <w:pPr>
-        <w:spacing w:after="60" w:line="22" w:lineRule="atLeast"/>
-        <w:rPr>
-          <w:rFonts w:cs="Segoe UI"/>
-          <w:color w:val="1A2634"/>
-          <w:sz w:val="21"/>
-          <w:szCs w:val="21"/>
-        </w:rPr>
-      </w:pPr>
-      <w:r>
-        <w:rPr>
-          <w:rFonts w:cs="Segoe UI"/>
-          <w:color w:val="1A2634"/>
-          <w:sz w:val="21"/>
-          <w:szCs w:val="21"/>
-        </w:rPr>
-        <w:t>{#projects}</w:t>
-      </w:r>
-    </w:p>
-    <w:p>
-      <w:pPr>
-        <w:spacing w:before="200" w:after="60" w:line="22" w:lineRule="atLeast"/>
-        <w:rPr>
-          <w:rFonts w:cs="Segoe UI"/>
-          <w:b/>
-          <w:bCs/>
-          <w:color w:val="1A2634"/>
-          <w:sz w:val="21"/>
-          <w:szCs w:val="21"/>
-        </w:rPr>
-      </w:pPr>
-      <w:r>
-        <w:rPr>
-          <w:rFonts w:cs="Segoe UI"/>
-          <w:b/>
-          <w:bCs/>
-          <w:color w:val="1A2634"/>
-          <w:sz w:val="21"/>
-          <w:szCs w:val="21"/>
-        </w:rPr>
-        <w:t>{</w:t>
-      </w:r>
-      <w:proofErr w:type="spellStart"/>
-      <w:r>
-        <w:rPr>
-          <w:rFonts w:cs="Segoe UI"/>
-          <w:b/>
-          <w:bCs/>
-          <w:color w:val="1A2634"/>
-          <w:sz w:val="21"/>
-          <w:szCs w:val="21"/>
-        </w:rPr>
-        <w:t>project_title</w:t>
-      </w:r>
-      <w:proofErr w:type="spellEnd"/>
-      <w:r>
-        <w:rPr>
-          <w:rFonts w:cs="Segoe UI"/>
-          <w:b/>
-          <w:bCs/>
-          <w:color w:val="1A2634"/>
-          <w:sz w:val="21"/>
-          <w:szCs w:val="21"/>
-        </w:rPr>
-        <w:t>}</w:t>
-      </w:r>
-    </w:p>
-    <w:p>
-      <w:pPr>
-        <w:spacing w:after="60" w:line="22" w:lineRule="atLeast"/>
-        <w:rPr>
-          <w:rFonts w:cs="Segoe UI"/>
-          <w:color w:val="1A2634"/>
-          <w:sz w:val="21"/>
-          <w:szCs w:val="21"/>
-        </w:rPr>
-      </w:pPr>
-      <w:r>
-        <w:rPr>
-          <w:rFonts w:cs="Segoe UI"/>
-          <w:color w:val="1A2634"/>
-          <w:sz w:val="21"/>
-          <w:szCs w:val="21"/>
-        </w:rPr>
-        <w:t>{start} – {end}</w:t>
-      </w:r>
-    </w:p>
-    <w:p>
-      <w:pPr>
-        <w:spacing w:after="60" w:line="22" w:lineRule="atLeast"/>
-        <w:rPr>
-          <w:rFonts w:cs="Segoe UI"/>
-          <w:color w:val="1A2634"/>
-          <w:sz w:val="21"/>
-          <w:szCs w:val="21"/>
-        </w:rPr>
-      </w:pPr>
-      <w:r>
-        <w:rPr>
-          <w:rFonts w:cs="Segoe UI"/>
-          <w:color w:val="1A2634"/>
-          <w:sz w:val="21"/>
-          <w:szCs w:val="21"/>
-        </w:rPr>
-        <w:t>{#project_description}</w:t>
-      </w:r>
-    </w:p>
-    <w:p>
-      <w:pPr>
-        <w:spacing w:after="60" w:line="22" w:lineRule="atLeast"/>
-        <w:rPr>
-          <w:rFonts w:cs="Segoe UI"/>
-          <w:color w:val="1A2634"/>
-          <w:sz w:val="21"/>
-          <w:szCs w:val="21"/>
-        </w:rPr>
-      </w:pPr>
-      <w:r>
-        <w:rPr>
-          <w:rFonts w:cs="Segoe UI"/>
-          <w:color w:val="1A2634"/>
-          <w:sz w:val="21"/>
-          <w:szCs w:val="21"/>
-        </w:rPr>
-        <w:t>{</w:t>
-      </w:r>
-      <w:proofErr w:type="spellStart"/>
-      <w:r>
-        <w:rPr>
-          <w:rFonts w:cs="Segoe UI"/>
-          <w:color w:val="1A2634"/>
-          <w:sz w:val="21"/>
-          <w:szCs w:val="21"/>
-        </w:rPr>
-        <w:t>project_description</w:t>
-      </w:r>
-      <w:proofErr w:type="spellEnd"/>
-      <w:r>
-        <w:rPr>
-          <w:rFonts w:cs="Segoe UI"/>
-          <w:color w:val="1A2634"/>
-          <w:sz w:val="21"/>
-          <w:szCs w:val="21"/>
-        </w:rPr>
-        <w:t>}</w:t>
-      </w:r>
-    </w:p>
-    <w:p>
-      <w:pPr>
-        <w:spacing w:after="60" w:line="22" w:lineRule="atLeast"/>
-        <w:rPr>
-          <w:rFonts w:cs="Segoe UI"/>
-          <w:color w:val="1A2634"/>
-          <w:sz w:val="21"/>
-          <w:szCs w:val="21"/>
-        </w:rPr>
-      </w:pPr>
-      <w:r>
-        <w:rPr>
-          <w:rFonts w:cs="Segoe UI"/>
-          <w:color w:val="1A2634"/>
-          <w:sz w:val="21"/>
-          <w:szCs w:val="21"/>
-        </w:rPr>
-        <w:t>{/</w:t>
-      </w:r>
-      <w:proofErr w:type="spellStart"/>
-      <w:r>
-        <w:rPr>
-          <w:rFonts w:cs="Segoe UI"/>
-          <w:color w:val="1A2634"/>
-          <w:sz w:val="21"/>
-          <w:szCs w:val="21"/>
-        </w:rPr>
-        <w:t>project_description</w:t>
-      </w:r>
-      <w:proofErr w:type="spellEnd"/>
-      <w:r>
-        <w:rPr>
-          <w:rFonts w:cs="Segoe UI"/>
-          <w:color w:val="1A2634"/>
-          <w:sz w:val="21"/>
-          <w:szCs w:val="21"/>
-        </w:rPr>
-        <w:t>}</w:t>
-      </w:r>
-    </w:p>
-    <w:p>
-      <w:pPr>
-        <w:spacing w:after="60" w:line="22" w:lineRule="atLeast"/>
-        <w:rPr>
-          <w:rFonts w:cs="Segoe UI"/>
-          <w:color w:val="1A2634"/>
-          <w:sz w:val="21"/>
-          <w:szCs w:val="21"/>
-        </w:rPr>
-      </w:pPr>
-      <w:r>
-        <w:rPr>
-          <w:rFonts w:cs="Segoe UI"/>
-          <w:color w:val="1A2634"/>
-          <w:sz w:val="21"/>
-          <w:szCs w:val="21"/>
-        </w:rPr>
-        <w:t>{#project_tasks}</w:t>
-      </w:r>
-    </w:p>
-    <w:p>
-      <w:pPr>
-        <w:spacing w:after="60" w:line="22" w:lineRule="atLeast"/>
-        <w:rPr>
-          <w:rFonts w:cs="Segoe UI"/>
-          <w:color w:val="1A2634"/>
-          <w:sz w:val="21"/>
-          <w:szCs w:val="21"/>
-        </w:rPr>
-      </w:pPr>
-      <w:r>
-        <w:rPr>
-          <w:rFonts w:cs="Segoe UI"/>
-          <w:color w:val="1A2634"/>
-          <w:sz w:val="24"/>
-          <w:szCs w:val="24"/>
-        </w:rPr>
-        <w:t>•</w:t>
-      </w:r>
-      <w:r>
-        <w:rPr>
-          <w:rFonts w:cs="Segoe UI"/>
-          <w:color w:val="1A2634"/>
-          <w:sz w:val="21"/>
-          <w:szCs w:val="21"/>
-        </w:rPr>
-        <w:t xml:space="preserve"> {.}</w:t>
-      </w:r>
-    </w:p>
-    <w:p>
-      <w:pPr>
-        <w:spacing w:after="60" w:line="22" w:lineRule="atLeast"/>
-        <w:rPr>
-          <w:rFonts w:cs="Segoe UI"/>
-          <w:color w:val="1A2634"/>
-          <w:sz w:val="21"/>
-          <w:szCs w:val="21"/>
-        </w:rPr>
-      </w:pPr>
-      <w:r>
-        <w:rPr>
-          <w:rFonts w:cs="Segoe UI"/>
-          <w:color w:val="1A2634"/>
-          <w:sz w:val="21"/>
-          <w:szCs w:val="21"/>
-        </w:rPr>
-        <w:t>{/</w:t>
-      </w:r>
-      <w:proofErr w:type="spellStart"/>
-      <w:r>
-        <w:rPr>
-          <w:rFonts w:cs="Segoe UI"/>
-          <w:color w:val="1A2634"/>
-          <w:sz w:val="21"/>
-          <w:szCs w:val="21"/>
-        </w:rPr>
-        <w:t>project_tasks</w:t>
-      </w:r>
-      <w:proofErr w:type="spellEnd"/>
-      <w:r>
-        <w:rPr>
-          <w:rFonts w:cs="Segoe UI"/>
-          <w:color w:val="1A2634"/>
-          <w:sz w:val="21"/>
-          <w:szCs w:val="21"/>
-        </w:rPr>
-        <w:t>}</w:t>
-      </w:r>
-    </w:p>
-    <w:p>
-      <w:pPr>
-        <w:spacing w:after="0" w:line="22" w:lineRule="atLeast"/>
-        <w:rPr>
-          <w:rFonts w:cs="Segoe UI"/>
-          <w:color w:val="1A2634"/>
-          <w:sz w:val="21"/>
-          <w:szCs w:val="21"/>
-        </w:rPr>
-      </w:pPr>
-      <w:r>
-        <w:rPr>
-          <w:rFonts w:cs="Segoe UI"/>
-          <w:color w:val="1A2634"/>
-          <w:sz w:val="21"/>
-          <w:szCs w:val="21"/>
-        </w:rPr>
-        <w:t>{/projects}</w:t>
-      </w:r>
-    </w:p>
-    <w:p>
-      <w:pPr>
-        <w:spacing w:before="200" w:after="0" w:line="22" w:lineRule="atLeast"/>
-        <w:rPr>
-          <w:rFonts w:cs="Segoe UI"/>
-          <w:color w:val="1A2634"/>
-          <w:sz w:val="21"/>
-          <w:szCs w:val="21"/>
-        </w:rPr>
-      </w:pPr>
-      <w:r>
-        <w:rPr>
-          <w:rFonts w:cs="Segoe UI"/>
-          <w:color w:val="1A2634"/>
-          <w:sz w:val="21"/>
-          <w:szCs w:val="21"/>
-        </w:rPr>
-        <w:lastRenderedPageBreak/>
-        <w:t>{#education}</w:t>
+        <w:t>{#HAS_CERTIFICATIONS}</w:t>
       </w:r>
     </w:p>
     <w:p>
@@ -898,274 +1178,15 @@
           <w:sz w:val="24"/>
           <w:szCs w:val="24"/>
         </w:rPr>
-        <w:t>EDUCATION</w:t>
+        <w:t>CERTIFICATIONS</w:t>
       </w:r>
     </w:p>
     <w:p>
       <w:pPr>
         <w:spacing w:after="60" w:line="22" w:lineRule="atLeast"/>
-        <w:rPr>
-          <w:rFonts w:cs="Segoe UI"/>
-          <w:color w:val="1A2634"/>
-          <w:sz w:val="21"/>
-          <w:szCs w:val="21"/>
-        </w:rPr>
       </w:pPr>
       <w:r>
-        <w:rPr>
-          <w:rFonts w:cs="Segoe UI"/>
-          <w:color w:val="1A2634"/>
-          <w:sz w:val="21"/>
-          <w:szCs w:val="21"/>
-        </w:rPr>
-        <w:t>{#education}</w:t>
-      </w:r>
-    </w:p>
-    <w:p>
-      <w:pPr>
-        <w:spacing w:before="200" w:after="60" w:line="22" w:lineRule="atLeast"/>
-        <w:rPr>
-          <w:rFonts w:cs="Segoe UI"/>
-          <w:color w:val="1A2634"/>
-          <w:sz w:val="21"/>
-          <w:szCs w:val="21"/>
-        </w:rPr>
-      </w:pPr>
-      <w:r>
-        <w:rPr>
-          <w:rFonts w:cs="Segoe UI"/>
-          <w:color w:val="1A2634"/>
-          <w:sz w:val="21"/>
-          <w:szCs w:val="21"/>
-        </w:rPr>
-        <w:t>{degree}</w:t>
-      </w:r>
-    </w:p>
-    <w:p>
-      <w:pPr>
-        <w:spacing w:after="60" w:line="22" w:lineRule="atLeast"/>
-        <w:rPr>
-          <w:rFonts w:cs="Segoe UI"/>
-          <w:color w:val="1A2634"/>
-          <w:sz w:val="21"/>
-          <w:szCs w:val="21"/>
-        </w:rPr>
-      </w:pPr>
-      <w:r>
-        <w:rPr>
-          <w:rFonts w:cs="Segoe UI"/>
-          <w:b/>
-          <w:bCs/>
-          <w:color w:val="1A2634"/>
-          <w:sz w:val="21"/>
-          <w:szCs w:val="21"/>
-        </w:rPr>
-        <w:t>{school}</w:t>
-      </w:r>
-      <w:r>
-        <w:rPr>
-          <w:rFonts w:cs="Segoe UI"/>
-          <w:color w:val="1A2634"/>
-          <w:sz w:val="21"/>
-          <w:szCs w:val="21"/>
-        </w:rPr>
-        <w:t>{#location}</w:t>
-      </w:r>
-      <w:r>
-        <w:rPr>
-          <w:rFonts w:cs="Segoe UI"/>
-          <w:color w:val="1A2634"/>
-          <w:sz w:val="21"/>
-          <w:szCs w:val="21"/>
-        </w:rPr>
-        <w:t xml:space="preserve"> |</w:t>
-      </w:r>
-      <w:r>
-        <w:rPr>
-          <w:rFonts w:cs="Segoe UI"/>
-          <w:color w:val="1A2634"/>
-          <w:sz w:val="21"/>
-          <w:szCs w:val="21"/>
-        </w:rPr>
-        <w:t xml:space="preserve"> {location}{/location}</w:t>
-      </w:r>
-    </w:p>
-    <w:p>
-      <w:pPr>
-        <w:spacing w:after="60" w:line="22" w:lineRule="atLeast"/>
-        <w:rPr>
-          <w:rFonts w:cs="Segoe UI"/>
-          <w:color w:val="1A2634"/>
-          <w:sz w:val="21"/>
-          <w:szCs w:val="21"/>
-        </w:rPr>
-      </w:pPr>
-      <w:r>
-        <w:rPr>
-          <w:rFonts w:cs="Segoe UI"/>
-          <w:color w:val="1A2634"/>
-          <w:sz w:val="21"/>
-          <w:szCs w:val="21"/>
-        </w:rPr>
-        <w:t>{start} – {end}</w:t>
-      </w:r>
-    </w:p>
-    <w:p>
-      <w:pPr>
-        <w:spacing w:after="60" w:line="22" w:lineRule="atLeast"/>
-        <w:rPr>
-          <w:rFonts w:cs="Segoe UI"/>
-          <w:color w:val="1A2634"/>
-          <w:sz w:val="21"/>
-          <w:szCs w:val="21"/>
-        </w:rPr>
-      </w:pPr>
-      <w:r>
-        <w:rPr>
-          <w:rFonts w:cs="Segoe UI"/>
-          <w:color w:val="1A2634"/>
-          <w:sz w:val="21"/>
-          <w:szCs w:val="21"/>
-        </w:rPr>
-        <w:t>{#edu_detail}</w:t>
-      </w:r>
-    </w:p>
-    <w:p>
-      <w:pPr>
-        <w:spacing w:after="60" w:line="22" w:lineRule="atLeast"/>
-        <w:rPr>
-          <w:rFonts w:cs="Segoe UI"/>
-          <w:color w:val="1A2634"/>
-          <w:sz w:val="21"/>
-          <w:szCs w:val="21"/>
-        </w:rPr>
-      </w:pPr>
-      <w:r>
-        <w:rPr>
-          <w:rFonts w:cs="Segoe UI"/>
-          <w:color w:val="1A2634"/>
-          <w:sz w:val="21"/>
-          <w:szCs w:val="21"/>
-        </w:rPr>
-        <w:t>{</w:t>
-      </w:r>
-      <w:proofErr w:type="spellStart"/>
-      <w:r>
-        <w:rPr>
-          <w:rFonts w:cs="Segoe UI"/>
-          <w:color w:val="1A2634"/>
-          <w:sz w:val="21"/>
-          <w:szCs w:val="21"/>
-        </w:rPr>
-        <w:t>edu_detail</w:t>
-      </w:r>
-      <w:proofErr w:type="spellEnd"/>
-      <w:r>
-        <w:rPr>
-          <w:rFonts w:cs="Segoe UI"/>
-          <w:color w:val="1A2634"/>
-          <w:sz w:val="21"/>
-          <w:szCs w:val="21"/>
-        </w:rPr>
-        <w:t>}</w:t>
-      </w:r>
-    </w:p>
-    <w:p>
-      <w:pPr>
-        <w:spacing w:after="60" w:line="22" w:lineRule="atLeast"/>
-        <w:rPr>
-          <w:rFonts w:cs="Segoe UI"/>
-          <w:color w:val="1A2634"/>
-          <w:sz w:val="21"/>
-          <w:szCs w:val="21"/>
-        </w:rPr>
-      </w:pPr>
-      <w:r>
-        <w:rPr>
-          <w:rFonts w:cs="Segoe UI"/>
-          <w:color w:val="1A2634"/>
-          <w:sz w:val="21"/>
-          <w:szCs w:val="21"/>
-        </w:rPr>
-        <w:t>{/</w:t>
-      </w:r>
-      <w:proofErr w:type="spellStart"/>
-      <w:r>
-        <w:rPr>
-          <w:rFonts w:cs="Segoe UI"/>
-          <w:color w:val="1A2634"/>
-          <w:sz w:val="21"/>
-          <w:szCs w:val="21"/>
-        </w:rPr>
-        <w:t>edu_detail</w:t>
-      </w:r>
-      <w:proofErr w:type="spellEnd"/>
-      <w:r>
-        <w:rPr>
-          <w:rFonts w:cs="Segoe UI"/>
-          <w:color w:val="1A2634"/>
-          <w:sz w:val="21"/>
-          <w:szCs w:val="21"/>
-        </w:rPr>
-        <w:t>}</w:t>
-      </w:r>
-    </w:p>
-    <w:p>
-      <w:pPr>
-        <w:spacing w:after="0" w:line="22" w:lineRule="atLeast"/>
-        <w:rPr>
-          <w:rFonts w:cs="Segoe UI"/>
-          <w:color w:val="1A2634"/>
-          <w:sz w:val="21"/>
-          <w:szCs w:val="21"/>
-        </w:rPr>
-      </w:pPr>
-      <w:r>
-        <w:rPr>
-          <w:rFonts w:cs="Segoe UI"/>
-          <w:color w:val="1A2634"/>
-          <w:sz w:val="21"/>
-          <w:szCs w:val="21"/>
-        </w:rPr>
-        <w:t>{/education}</w:t>
-      </w:r>
-    </w:p>
-    <w:p>
-      <w:pPr>
-        <w:pBdr>
-          <w:bottom w:val="single" w:sz="8" w:space="1" w:color="auto"/>
-        </w:pBdr>
-        <w:spacing w:before="200" w:after="120"/>
-      </w:pPr>
-      <w:r>
-        <w:t>{#certifications}</w:t>
-      </w:r>
-    </w:p>
-    <w:p>
-      <w:pPr>
-        <w:pBdr>
-          <w:bottom w:val="single" w:sz="8" w:space="1" w:color="auto"/>
-        </w:pBdr>
-        <w:spacing w:before="200" w:after="120"/>
-        <w:rPr>
-          <w:rFonts w:cs="Segoe UI"/>
-          <w:b/>
-          <w:bCs/>
-          <w:color w:val="1A2634"/>
-          <w:sz w:val="24"/>
-          <w:szCs w:val="24"/>
-        </w:rPr>
-      </w:pPr>
-      <w:r>
-        <w:rPr>
-          <w:rFonts w:cs="Segoe UI"/>
-          <w:b/>
-          <w:bCs/>
-          <w:color w:val="1A2634"/>
-          <w:sz w:val="24"/>
-          <w:szCs w:val="24"/>
-        </w:rPr>
-        <w:t>CERTIFICATIONS</w:t>
+        <w:t>{/HAS_CERTIFICATIONS}</w:t>
       </w:r>
     </w:p>
     <w:p>
@@ -1218,7 +1239,7 @@
         <w:spacing w:before="200" w:after="120"/>
       </w:pPr>
       <w:r>
-        <w:t>{#extra_sections}</w:t>
+        <w:t>{#HAS_EXTRA}</w:t>
       </w:r>
     </w:p>
     <w:p>
@@ -1246,6 +1267,22 @@
           <w:szCs w:val="24"/>
         </w:rPr>
         <w:t>ADDITIONAL INFORMATION</w:t>
+      </w:r>
+    </w:p>
+    <w:p>
+      <w:pPr>
+        <w:spacing w:before="200" w:after="0" w:line="22" w:lineRule="atLeast"/>
+      </w:pPr>
+      <w:r>
+        <w:t>{/HAS_EXTRA}</w:t>
+      </w:r>
+    </w:p>
+    <w:p>
+      <w:pPr>
+        <w:spacing w:before="200" w:after="0" w:line="22" w:lineRule="atLeast"/>
+      </w:pPr>
+      <w:r>
+        <w:t>{#extra_sections}</w:t>
       </w:r>
     </w:p>
     <w:p>
@@ -2414,7 +2451,6 @@
   <w:style w:type="character" w:default="1" w:styleId="DefaultParagraphFont">
     <w:name w:val="Default Paragraph Font"/>
     <w:uiPriority w:val="1"/>
-    <w:semiHidden/>
     <w:unhideWhenUsed/>
   </w:style>
   <w:style w:type="table" w:default="1" w:styleId="TableNormal">

</xml_diff>

<commit_message>
Add ATS CV generator improvements with edu competencies
</commit_message>
<xml_diff>
--- a/templates/template_professional.docx
+++ b/templates/template_professional.docx
@@ -73,7 +73,7 @@
     </w:p>
     <w:p>
       <w:pPr>
-        <w:spacing w:after="60" w:line="22" w:lineRule="atLeast"/>
+        <w:spacing w:after="0" w:line="22" w:lineRule="atLeast"/>
         <w:rPr>
           <w:rFonts w:cs="Segoe UI"/>
           <w:color w:val="1A2634"/>
@@ -96,7 +96,7 @@
         <w:pBdr>
           <w:bottom w:val="single" w:sz="8" w:space="1" w:color="auto"/>
         </w:pBdr>
-        <w:spacing w:before="200" w:after="120"/>
+        <w:spacing w:after="0"/>
       </w:pPr>
       <w:r>
         <w:t>{#HAS_SKILLS}</w:t>
@@ -132,80 +132,66 @@
     <w:p>
       <w:pPr>
         <w:spacing w:after="0" w:line="22" w:lineRule="atLeast"/>
+        <w:rPr>
+          <w:sz w:val="21"/>
+          <w:szCs w:val="21"/>
+        </w:rPr>
       </w:pPr>
       <w:r>
-        <w:t>{/HAS_SKILLS}</w:t>
+        <w:rPr>
+          <w:sz w:val="21"/>
+          <w:szCs w:val="21"/>
+        </w:rPr>
+        <w:t>{SKILLS_LINE}</w:t>
       </w:r>
     </w:p>
     <w:p>
       <w:pPr>
         <w:spacing w:after="0" w:line="22" w:lineRule="atLeast"/>
         <w:rPr>
-          <w:rFonts w:cs="Segoe UI"/>
-          <w:color w:val="1A2634"/>
           <w:sz w:val="21"/>
           <w:szCs w:val="21"/>
         </w:rPr>
       </w:pPr>
       <w:r>
         <w:rPr>
-          <w:rFonts w:cs="Segoe UI"/>
-          <w:color w:val="1A2634"/>
           <w:sz w:val="21"/>
           <w:szCs w:val="21"/>
         </w:rPr>
-        <w:t>{#skills}</w:t>
+        <w:t>{/HAS_</w:t>
+      </w:r>
+      <w:r>
+        <w:rPr>
+          <w:sz w:val="21"/>
+          <w:szCs w:val="21"/>
+        </w:rPr>
+        <w:t>SKILLS</w:t>
+      </w:r>
+      <w:r>
+        <w:rPr>
+          <w:sz w:val="21"/>
+          <w:szCs w:val="21"/>
+        </w:rPr>
+        <w:t>}</w:t>
       </w:r>
     </w:p>
     <w:p>
       <w:pPr>
-        <w:spacing w:before="200" w:after="0" w:line="22" w:lineRule="atLeast"/>
+        <w:pBdr>
+          <w:bottom w:val="single" w:sz="8" w:space="1" w:color="auto"/>
+        </w:pBdr>
+        <w:spacing w:after="0"/>
         <w:rPr>
-          <w:rFonts w:cs="Segoe UI"/>
-          <w:color w:val="1A2634"/>
           <w:sz w:val="21"/>
           <w:szCs w:val="21"/>
         </w:rPr>
       </w:pPr>
       <w:r>
         <w:rPr>
-          <w:rFonts w:cs="Segoe UI"/>
-          <w:color w:val="1A2634"/>
           <w:sz w:val="21"/>
           <w:szCs w:val="21"/>
         </w:rPr>
-        <w:t>• {.}</w:t>
-      </w:r>
-    </w:p>
-    <w:p>
-      <w:pPr>
-        <w:spacing w:after="0" w:line="22" w:lineRule="atLeast"/>
-        <w:rPr>
-          <w:rFonts w:cs="Segoe UI"/>
-          <w:color w:val="1A2634"/>
-          <w:sz w:val="21"/>
-          <w:szCs w:val="21"/>
-        </w:rPr>
-      </w:pPr>
-      <w:r>
-        <w:rPr>
-          <w:rFonts w:cs="Segoe UI"/>
-          <w:color w:val="1A2634"/>
-          <w:sz w:val="21"/>
-          <w:szCs w:val="21"/>
-        </w:rPr>
-        <w:t>{/skills}</w:t>
-      </w:r>
-    </w:p>
-    <w:p>
-      <w:pPr>
-        <w:pBdr>
-          <w:bottom w:val="single" w:sz="8" w:space="1" w:color="auto"/>
-        </w:pBdr>
-        <w:spacing w:before="200" w:after="120"/>
-      </w:pPr>
-      <w:r>
-        <w:t>{#HAS_EXPERIENCE}</w:t>
+        <w:t>{#HAS_EDUCATION}</w:t>
       </w:r>
     </w:p>
     <w:p>
@@ -237,22 +223,39 @@
     </w:p>
     <w:p>
       <w:pPr>
-        <w:spacing w:before="200" w:after="60" w:line="22" w:lineRule="atLeast"/>
+        <w:spacing w:after="0" w:line="22" w:lineRule="atLeast"/>
+        <w:rPr>
+          <w:sz w:val="21"/>
+          <w:szCs w:val="21"/>
+        </w:rPr>
       </w:pPr>
       <w:r>
+        <w:rPr>
+          <w:sz w:val="21"/>
+          <w:szCs w:val="21"/>
+        </w:rPr>
         <w:t>{/HAS_EXPERIENCE}</w:t>
       </w:r>
+    </w:p>
+    <w:p>
+      <w:pPr>
+        <w:spacing w:after="0" w:line="22" w:lineRule="atLeast"/>
+        <w:rPr>
+          <w:sz w:val="21"/>
+          <w:szCs w:val="21"/>
+        </w:rPr>
+      </w:pPr>
       <w:r>
-        <w:br/>
-      </w:r>
-      <w:r>
-        <w:br/>
+        <w:rPr>
+          <w:sz w:val="21"/>
+          <w:szCs w:val="21"/>
+        </w:rPr>
         <w:t>{#experience}</w:t>
       </w:r>
     </w:p>
     <w:p>
       <w:pPr>
-        <w:spacing w:before="200" w:after="60" w:line="22" w:lineRule="atLeast"/>
+        <w:spacing w:after="0" w:line="22" w:lineRule="atLeast"/>
         <w:rPr>
           <w:rFonts w:cs="Segoe UI"/>
           <w:b/>
@@ -276,7 +279,7 @@
     </w:p>
     <w:p>
       <w:pPr>
-        <w:spacing w:after="60" w:line="22" w:lineRule="atLeast"/>
+        <w:spacing w:after="0" w:line="22" w:lineRule="atLeast"/>
         <w:rPr>
           <w:rFonts w:cs="Segoe UI"/>
           <w:color w:val="1A2634"/>
@@ -302,8 +305,19 @@
           <w:sz w:val="21"/>
           <w:szCs w:val="21"/>
         </w:rPr>
-        <w:t>{#location}</w:t>
+        <w:t>{#location} | {location}{/location}</w:t>
       </w:r>
+    </w:p>
+    <w:p>
+      <w:pPr>
+        <w:spacing w:after="0" w:line="22" w:lineRule="atLeast"/>
+        <w:rPr>
+          <w:rFonts w:cs="Segoe UI"/>
+          <w:color w:val="1A2634"/>
+          <w:sz w:val="21"/>
+          <w:szCs w:val="21"/>
+        </w:rPr>
+      </w:pPr>
       <w:r>
         <w:rPr>
           <w:rFonts w:cs="Segoe UI"/>
@@ -311,41 +325,12 @@
           <w:sz w:val="21"/>
           <w:szCs w:val="21"/>
         </w:rPr>
-        <w:t xml:space="preserve"> |</w:t>
-      </w:r>
-      <w:r>
-        <w:rPr>
-          <w:rFonts w:cs="Segoe UI"/>
-          <w:color w:val="1A2634"/>
-          <w:sz w:val="21"/>
-          <w:szCs w:val="21"/>
-        </w:rPr>
-        <w:t xml:space="preserve"> {location}{/location}</w:t>
+        <w:t>{#start}{start}{/start}{#end_or_present} – {end_or_present}{/end_or_present}</w:t>
       </w:r>
     </w:p>
     <w:p>
       <w:pPr>
-        <w:spacing w:after="60" w:line="22" w:lineRule="atLeast"/>
-        <w:rPr>
-          <w:rFonts w:cs="Segoe UI"/>
-          <w:color w:val="1A2634"/>
-          <w:sz w:val="21"/>
-          <w:szCs w:val="21"/>
-        </w:rPr>
-      </w:pPr>
-      <w:r>
-        <w:rPr>
-          <w:rFonts w:cs="Segoe UI"/>
-          <w:color w:val="1A2634"/>
-          <w:sz w:val="21"/>
-          <w:szCs w:val="21"/>
-        </w:rPr>
-        <w:t>{start} – {end_or_present}</w:t>
-      </w:r>
-    </w:p>
-    <w:p>
-      <w:pPr>
-        <w:spacing w:after="60" w:line="22" w:lineRule="atLeast"/>
+        <w:spacing w:after="0" w:line="22" w:lineRule="atLeast"/>
         <w:rPr>
           <w:rFonts w:cs="Segoe UI"/>
           <w:color w:val="1A2634"/>
@@ -365,7 +350,7 @@
     </w:p>
     <w:p>
       <w:pPr>
-        <w:spacing w:after="60" w:line="22" w:lineRule="atLeast"/>
+        <w:spacing w:after="0" w:line="22" w:lineRule="atLeast"/>
         <w:rPr>
           <w:rFonts w:cs="Segoe UI"/>
           <w:color w:val="1A2634"/>
@@ -385,7 +370,7 @@
     </w:p>
     <w:p>
       <w:pPr>
-        <w:spacing w:after="60" w:line="22" w:lineRule="atLeast"/>
+        <w:spacing w:after="0" w:line="22" w:lineRule="atLeast"/>
         <w:rPr>
           <w:rFonts w:cs="Segoe UI"/>
           <w:color w:val="1A2634"/>
@@ -405,7 +390,7 @@
     </w:p>
     <w:p>
       <w:pPr>
-        <w:spacing w:after="60" w:line="22" w:lineRule="atLeast"/>
+        <w:spacing w:after="0" w:line="22" w:lineRule="atLeast"/>
         <w:rPr>
           <w:rFonts w:cs="Segoe UI"/>
           <w:color w:val="1A2634"/>
@@ -425,7 +410,7 @@
     </w:p>
     <w:p>
       <w:pPr>
-        <w:spacing w:after="60" w:line="22" w:lineRule="atLeast"/>
+        <w:spacing w:after="0" w:line="22" w:lineRule="atLeast"/>
         <w:rPr>
           <w:rFonts w:cs="Segoe UI"/>
           <w:color w:val="1A2634"/>
@@ -433,15 +418,6 @@
           <w:szCs w:val="21"/>
         </w:rPr>
       </w:pPr>
-      <w:r>
-        <w:rPr>
-          <w:rFonts w:cs="Segoe UI"/>
-          <w:color w:val="1A2634"/>
-          <w:sz w:val="24"/>
-          <w:szCs w:val="24"/>
-        </w:rPr>
-        <w:t>•</w:t>
-      </w:r>
       <w:r>
         <w:rPr>
           <w:rFonts w:cs="Segoe UI"/>
@@ -449,12 +425,12 @@
           <w:sz w:val="21"/>
           <w:szCs w:val="21"/>
         </w:rPr>
-        <w:t xml:space="preserve"> {.}</w:t>
+        <w:t>• {.}</w:t>
       </w:r>
     </w:p>
     <w:p>
       <w:pPr>
-        <w:spacing w:after="60" w:line="22" w:lineRule="atLeast"/>
+        <w:spacing w:after="0" w:line="22" w:lineRule="atLeast"/>
         <w:rPr>
           <w:rFonts w:cs="Segoe UI"/>
           <w:color w:val="1A2634"/>
@@ -494,10 +470,13 @@
     </w:p>
     <w:p>
       <w:pPr>
-        <w:pBdr>
-          <w:bottom w:val="single" w:sz="8" w:space="1" w:color="auto"/>
-        </w:pBdr>
-        <w:spacing w:before="200" w:after="120"/>
+        <w:spacing w:after="0" w:line="22" w:lineRule="atLeast"/>
+        <w:rPr>
+          <w:rFonts w:cs="Segoe UI"/>
+          <w:color w:val="1A2634"/>
+          <w:sz w:val="21"/>
+          <w:szCs w:val="21"/>
+        </w:rPr>
       </w:pPr>
       <w:r>
         <w:t>{#HAS_PROJECTS}</w:t>
@@ -532,7 +511,7 @@
     </w:p>
     <w:p>
       <w:pPr>
-        <w:spacing w:after="60" w:line="22" w:lineRule="atLeast"/>
+        <w:spacing w:after="0" w:line="22" w:lineRule="atLeast"/>
       </w:pPr>
       <w:r>
         <w:t>{/HAS_PROJECTS}</w:t>
@@ -540,18 +519,14 @@
     </w:p>
     <w:p>
       <w:pPr>
-        <w:spacing w:after="60" w:line="22" w:lineRule="atLeast"/>
+        <w:spacing w:after="0" w:line="22" w:lineRule="atLeast"/>
         <w:rPr>
-          <w:rFonts w:cs="Segoe UI"/>
-          <w:color w:val="1A2634"/>
           <w:sz w:val="21"/>
           <w:szCs w:val="21"/>
         </w:rPr>
       </w:pPr>
       <w:r>
         <w:rPr>
-          <w:rFonts w:cs="Segoe UI"/>
-          <w:color w:val="1A2634"/>
           <w:sz w:val="21"/>
           <w:szCs w:val="21"/>
         </w:rPr>
@@ -560,7 +535,7 @@
     </w:p>
     <w:p>
       <w:pPr>
-        <w:spacing w:before="200" w:after="60" w:line="22" w:lineRule="atLeast"/>
+        <w:spacing w:after="0" w:line="22" w:lineRule="atLeast"/>
         <w:rPr>
           <w:rFonts w:cs="Segoe UI"/>
           <w:b/>
@@ -584,7 +559,7 @@
     </w:p>
     <w:p>
       <w:pPr>
-        <w:spacing w:after="60" w:line="22" w:lineRule="atLeast"/>
+        <w:spacing w:after="0" w:line="22" w:lineRule="atLeast"/>
         <w:rPr>
           <w:rFonts w:cs="Segoe UI"/>
           <w:color w:val="1A2634"/>
@@ -599,12 +574,12 @@
           <w:sz w:val="21"/>
           <w:szCs w:val="21"/>
         </w:rPr>
-        <w:t>{start} – {end_or_present}</w:t>
+        <w:t>{#start}{start}{/start}{#end_or_present} – {end_or_present}{/end_or_present}</w:t>
       </w:r>
     </w:p>
     <w:p>
       <w:pPr>
-        <w:spacing w:after="60" w:line="22" w:lineRule="atLeast"/>
+        <w:spacing w:after="0" w:line="22" w:lineRule="atLeast"/>
         <w:rPr>
           <w:rFonts w:cs="Segoe UI"/>
           <w:color w:val="1A2634"/>
@@ -624,7 +599,7 @@
     </w:p>
     <w:p>
       <w:pPr>
-        <w:spacing w:after="60" w:line="22" w:lineRule="atLeast"/>
+        <w:spacing w:after="0" w:line="22" w:lineRule="atLeast"/>
         <w:rPr>
           <w:rFonts w:cs="Segoe UI"/>
           <w:color w:val="1A2634"/>
@@ -644,7 +619,7 @@
     </w:p>
     <w:p>
       <w:pPr>
-        <w:spacing w:after="60" w:line="22" w:lineRule="atLeast"/>
+        <w:spacing w:after="0" w:line="22" w:lineRule="atLeast"/>
         <w:rPr>
           <w:rFonts w:cs="Segoe UI"/>
           <w:color w:val="1A2634"/>
@@ -664,7 +639,7 @@
     </w:p>
     <w:p>
       <w:pPr>
-        <w:spacing w:after="60" w:line="22" w:lineRule="atLeast"/>
+        <w:spacing w:after="0" w:line="22" w:lineRule="atLeast"/>
         <w:rPr>
           <w:rFonts w:cs="Segoe UI"/>
           <w:color w:val="1A2634"/>
@@ -679,13 +654,12 @@
           <w:sz w:val="21"/>
           <w:szCs w:val="21"/>
         </w:rPr>
-        <w:lastRenderedPageBreak/>
         <w:t>{#project_tasks}</w:t>
       </w:r>
     </w:p>
     <w:p>
       <w:pPr>
-        <w:spacing w:after="60" w:line="22" w:lineRule="atLeast"/>
+        <w:spacing w:after="0" w:line="22" w:lineRule="atLeast"/>
         <w:rPr>
           <w:rFonts w:cs="Segoe UI"/>
           <w:color w:val="1A2634"/>
@@ -693,15 +667,6 @@
           <w:szCs w:val="21"/>
         </w:rPr>
       </w:pPr>
-      <w:r>
-        <w:rPr>
-          <w:rFonts w:cs="Segoe UI"/>
-          <w:color w:val="1A2634"/>
-          <w:sz w:val="24"/>
-          <w:szCs w:val="24"/>
-        </w:rPr>
-        <w:t>•</w:t>
-      </w:r>
       <w:r>
         <w:rPr>
           <w:rFonts w:cs="Segoe UI"/>
@@ -709,12 +674,12 @@
           <w:sz w:val="21"/>
           <w:szCs w:val="21"/>
         </w:rPr>
-        <w:t xml:space="preserve"> {.}</w:t>
+        <w:t>• {.}</w:t>
       </w:r>
     </w:p>
     <w:p>
       <w:pPr>
-        <w:spacing w:after="60" w:line="22" w:lineRule="atLeast"/>
+        <w:spacing w:after="0" w:line="22" w:lineRule="atLeast"/>
         <w:rPr>
           <w:rFonts w:cs="Segoe UI"/>
           <w:color w:val="1A2634"/>
@@ -792,15 +757,31 @@
     </w:p>
     <w:p>
       <w:pPr>
-        <w:spacing w:after="60" w:line="22" w:lineRule="atLeast"/>
+        <w:spacing w:after="0" w:line="22" w:lineRule="atLeast"/>
+        <w:rPr>
+          <w:sz w:val="21"/>
+          <w:szCs w:val="21"/>
+        </w:rPr>
       </w:pPr>
       <w:r>
+        <w:rPr>
+          <w:sz w:val="21"/>
+          <w:szCs w:val="21"/>
+        </w:rPr>
         <w:t>{/HAS_EDUCATION}</w:t>
       </w:r>
     </w:p>
     <w:p>
       <w:pPr>
-        <w:spacing w:after="60" w:line="22" w:lineRule="atLeast"/>
+        <w:spacing w:after="0" w:line="22" w:lineRule="atLeast"/>
+      </w:pPr>
+      <w:r>
+        <w:t>{#education}</w:t>
+      </w:r>
+    </w:p>
+    <w:p>
+      <w:pPr>
+        <w:spacing w:after="0" w:line="22" w:lineRule="atLeast"/>
         <w:rPr>
           <w:rFonts w:cs="Segoe UI"/>
           <w:color w:val="1A2634"/>
@@ -815,32 +796,13 @@
           <w:sz w:val="21"/>
           <w:szCs w:val="21"/>
         </w:rPr>
-        <w:t>{#education}</w:t>
-      </w:r>
-    </w:p>
-    <w:p>
-      <w:pPr>
-        <w:spacing w:before="200" w:after="60" w:line="22" w:lineRule="atLeast"/>
-        <w:rPr>
-          <w:rFonts w:cs="Segoe UI"/>
-          <w:color w:val="1A2634"/>
-          <w:sz w:val="21"/>
-          <w:szCs w:val="21"/>
-        </w:rPr>
-      </w:pPr>
-      <w:r>
-        <w:rPr>
-          <w:rFonts w:cs="Segoe UI"/>
-          <w:color w:val="1A2634"/>
-          <w:sz w:val="21"/>
-          <w:szCs w:val="21"/>
-        </w:rPr>
+        <w:lastRenderedPageBreak/>
         <w:t>{degree}</w:t>
       </w:r>
     </w:p>
     <w:p>
       <w:pPr>
-        <w:spacing w:after="60" w:line="22" w:lineRule="atLeast"/>
+        <w:spacing w:after="0" w:line="22" w:lineRule="atLeast"/>
         <w:rPr>
           <w:rFonts w:cs="Segoe UI"/>
           <w:color w:val="1A2634"/>
@@ -866,8 +828,22 @@
           <w:sz w:val="21"/>
           <w:szCs w:val="21"/>
         </w:rPr>
-        <w:t>{#location}</w:t>
+        <w:t>{#location} | {location}{/location}</w:t>
       </w:r>
+    </w:p>
+    <w:p>
+      <w:pPr>
+        <w:pBdr>
+          <w:bottom w:val="single" w:sz="8" w:space="1" w:color="auto"/>
+        </w:pBdr>
+        <w:spacing w:after="120"/>
+        <w:rPr>
+          <w:rFonts w:cs="Segoe UI"/>
+          <w:color w:val="1A2634"/>
+          <w:sz w:val="21"/>
+          <w:szCs w:val="21"/>
+        </w:rPr>
+      </w:pPr>
       <w:r>
         <w:rPr>
           <w:rFonts w:cs="Segoe UI"/>
@@ -875,116 +851,7 @@
           <w:sz w:val="21"/>
           <w:szCs w:val="21"/>
         </w:rPr>
-        <w:t xml:space="preserve"> |</w:t>
-      </w:r>
-      <w:r>
-        <w:rPr>
-          <w:rFonts w:cs="Segoe UI"/>
-          <w:color w:val="1A2634"/>
-          <w:sz w:val="21"/>
-          <w:szCs w:val="21"/>
-        </w:rPr>
-        <w:t xml:space="preserve"> {location}{/location}</w:t>
-      </w:r>
-    </w:p>
-    <w:p>
-      <w:pPr>
-        <w:spacing w:after="60" w:line="22" w:lineRule="atLeast"/>
-        <w:rPr>
-          <w:rFonts w:cs="Segoe UI"/>
-          <w:color w:val="1A2634"/>
-          <w:sz w:val="21"/>
-          <w:szCs w:val="21"/>
-        </w:rPr>
-      </w:pPr>
-      <w:r>
-        <w:rPr>
-          <w:rFonts w:cs="Segoe UI"/>
-          <w:color w:val="1A2634"/>
-          <w:sz w:val="21"/>
-          <w:szCs w:val="21"/>
-        </w:rPr>
-        <w:t>{start} – {end_or_present}</w:t>
-      </w:r>
-    </w:p>
-    <w:p>
-      <w:pPr>
-        <w:spacing w:after="60" w:line="22" w:lineRule="atLeast"/>
-        <w:rPr>
-          <w:rFonts w:cs="Segoe UI"/>
-          <w:color w:val="1A2634"/>
-          <w:sz w:val="21"/>
-          <w:szCs w:val="21"/>
-        </w:rPr>
-      </w:pPr>
-      <w:r>
-        <w:rPr>
-          <w:rFonts w:cs="Segoe UI"/>
-          <w:color w:val="1A2634"/>
-          <w:sz w:val="21"/>
-          <w:szCs w:val="21"/>
-        </w:rPr>
-        <w:t>{#edu_detail}</w:t>
-      </w:r>
-    </w:p>
-    <w:p>
-      <w:pPr>
-        <w:spacing w:after="60" w:line="22" w:lineRule="atLeast"/>
-        <w:rPr>
-          <w:rFonts w:cs="Segoe UI"/>
-          <w:color w:val="1A2634"/>
-          <w:sz w:val="21"/>
-          <w:szCs w:val="21"/>
-        </w:rPr>
-      </w:pPr>
-      <w:r>
-        <w:rPr>
-          <w:rFonts w:cs="Segoe UI"/>
-          <w:color w:val="1A2634"/>
-          <w:sz w:val="21"/>
-          <w:szCs w:val="21"/>
-        </w:rPr>
-        <w:t>{edu_detail}</w:t>
-      </w:r>
-    </w:p>
-    <w:p>
-      <w:pPr>
-        <w:spacing w:after="60" w:line="22" w:lineRule="atLeast"/>
-        <w:rPr>
-          <w:rFonts w:cs="Segoe UI"/>
-          <w:color w:val="1A2634"/>
-          <w:sz w:val="21"/>
-          <w:szCs w:val="21"/>
-        </w:rPr>
-      </w:pPr>
-      <w:r>
-        <w:rPr>
-          <w:rFonts w:cs="Segoe UI"/>
-          <w:color w:val="1A2634"/>
-          <w:sz w:val="21"/>
-          <w:szCs w:val="21"/>
-        </w:rPr>
-        <w:t>{/edu_detail}</w:t>
-      </w:r>
-    </w:p>
-    <w:p>
-      <w:pPr>
-        <w:spacing w:after="0" w:line="22" w:lineRule="atLeast"/>
-        <w:rPr>
-          <w:rFonts w:cs="Segoe UI"/>
-          <w:color w:val="1A2634"/>
-          <w:sz w:val="21"/>
-          <w:szCs w:val="21"/>
-        </w:rPr>
-      </w:pPr>
-      <w:r>
-        <w:rPr>
-          <w:rFonts w:cs="Segoe UI"/>
-          <w:color w:val="1A2634"/>
-          <w:sz w:val="21"/>
-          <w:szCs w:val="21"/>
-        </w:rPr>
-        <w:t>{/education}</w:t>
+        <w:t>{#start}{start}{/start}{#end_or_present} – {end_or_present}{/end_or_present}</w:t>
       </w:r>
     </w:p>
     <w:p>
@@ -1027,26 +894,30 @@
     </w:p>
     <w:p>
       <w:pPr>
-        <w:spacing w:after="60" w:line="22" w:lineRule="atLeast"/>
+        <w:spacing w:after="0" w:line="22" w:lineRule="atLeast"/>
+        <w:rPr>
+          <w:sz w:val="21"/>
+          <w:szCs w:val="21"/>
+        </w:rPr>
       </w:pPr>
       <w:r>
+        <w:rPr>
+          <w:sz w:val="21"/>
+          <w:szCs w:val="21"/>
+        </w:rPr>
         <w:t>{/HAS_CERTIFICATIONS}</w:t>
       </w:r>
     </w:p>
     <w:p>
       <w:pPr>
-        <w:spacing w:after="60" w:line="22" w:lineRule="atLeast"/>
+        <w:spacing w:after="0" w:line="22" w:lineRule="atLeast"/>
         <w:rPr>
-          <w:rFonts w:cs="Segoe UI"/>
-          <w:color w:val="1A2634"/>
           <w:sz w:val="21"/>
           <w:szCs w:val="21"/>
         </w:rPr>
       </w:pPr>
       <w:r>
         <w:rPr>
-          <w:rFonts w:cs="Segoe UI"/>
-          <w:color w:val="1A2634"/>
           <w:sz w:val="21"/>
           <w:szCs w:val="21"/>
         </w:rPr>
@@ -1055,15 +926,29 @@
     </w:p>
     <w:p>
       <w:pPr>
-        <w:spacing w:after="60" w:line="22" w:lineRule="atLeast"/>
+        <w:spacing w:after="0" w:line="22" w:lineRule="atLeast"/>
+        <w:rPr>
+          <w:sz w:val="21"/>
+          <w:szCs w:val="21"/>
+        </w:rPr>
       </w:pPr>
       <w:r>
+        <w:rPr>
+          <w:sz w:val="21"/>
+          <w:szCs w:val="21"/>
+        </w:rPr>
         <w:t>• {.}</w:t>
       </w:r>
     </w:p>
     <w:p>
       <w:pPr>
-        <w:spacing w:after="60" w:line="22" w:lineRule="atLeast"/>
+        <w:spacing w:after="0" w:line="22" w:lineRule="atLeast"/>
+        <w:rPr>
+          <w:rFonts w:cs="Segoe UI"/>
+          <w:color w:val="1A2634"/>
+          <w:sz w:val="21"/>
+          <w:szCs w:val="21"/>
+        </w:rPr>
       </w:pPr>
       <w:r>
         <w:rPr>
@@ -1080,9 +965,17 @@
         <w:pBdr>
           <w:bottom w:val="single" w:sz="8" w:space="1" w:color="auto"/>
         </w:pBdr>
-        <w:spacing w:before="200" w:after="120"/>
+        <w:spacing w:after="0"/>
+        <w:rPr>
+          <w:sz w:val="21"/>
+          <w:szCs w:val="21"/>
+        </w:rPr>
       </w:pPr>
       <w:r>
+        <w:rPr>
+          <w:sz w:val="21"/>
+          <w:szCs w:val="21"/>
+        </w:rPr>
         <w:t>{#HAS_EXTRA}</w:t>
       </w:r>
     </w:p>
@@ -1116,22 +1009,6 @@
     <w:p>
       <w:pPr>
         <w:spacing w:before="200" w:after="0" w:line="22" w:lineRule="atLeast"/>
-      </w:pPr>
-      <w:r>
-        <w:t>{/HAS_EXTRA}</w:t>
-      </w:r>
-    </w:p>
-    <w:p>
-      <w:pPr>
-        <w:spacing w:before="200" w:after="0" w:line="22" w:lineRule="atLeast"/>
-      </w:pPr>
-      <w:r>
-        <w:t>{#extra_sections}</w:t>
-      </w:r>
-    </w:p>
-    <w:p>
-      <w:pPr>
-        <w:spacing w:before="200" w:after="0" w:line="22" w:lineRule="atLeast"/>
         <w:rPr>
           <w:rFonts w:cs="Segoe UI"/>
           <w:color w:val="1A2634"/>
@@ -1146,6 +1023,36 @@
           <w:sz w:val="21"/>
           <w:szCs w:val="21"/>
         </w:rPr>
+        <w:t>{/HAS_EXTRA}</w:t>
+      </w:r>
+      <w:r>
+        <w:rPr>
+          <w:rFonts w:cs="Segoe UI"/>
+          <w:color w:val="1A2634"/>
+          <w:sz w:val="21"/>
+          <w:szCs w:val="21"/>
+        </w:rPr>
+        <w:br/>
+        <w:t>{#extra_sections}</w:t>
+      </w:r>
+      <w:r>
+        <w:rPr>
+          <w:rFonts w:cs="Segoe UI"/>
+          <w:color w:val="1A2634"/>
+          <w:sz w:val="21"/>
+          <w:szCs w:val="21"/>
+        </w:rPr>
+        <w:br/>
+        <w:t>{#section_title}</w:t>
+      </w:r>
+      <w:r>
+        <w:rPr>
+          <w:rFonts w:cs="Segoe UI"/>
+          <w:color w:val="1A2634"/>
+          <w:sz w:val="21"/>
+          <w:szCs w:val="21"/>
+        </w:rPr>
+        <w:br/>
         <w:t>{section_title}</w:t>
       </w:r>
       <w:r>
@@ -1156,6 +1063,7 @@
           <w:szCs w:val="21"/>
         </w:rPr>
         <w:br/>
+        <w:t>{/section_title}</w:t>
       </w:r>
       <w:r>
         <w:rPr>
@@ -1195,15 +1103,6 @@
           <w:szCs w:val="21"/>
         </w:rPr>
         <w:br/>
-      </w:r>
-      <w:r>
-        <w:rPr>
-          <w:rFonts w:cs="Segoe UI"/>
-          <w:color w:val="1A2634"/>
-          <w:sz w:val="21"/>
-          <w:szCs w:val="21"/>
-        </w:rPr>
-        <w:br/>
         <w:t>{#section_content}</w:t>
       </w:r>
       <w:r>
@@ -1234,15 +1133,6 @@
           <w:szCs w:val="21"/>
         </w:rPr>
         <w:br/>
-      </w:r>
-      <w:r>
-        <w:rPr>
-          <w:rFonts w:cs="Segoe UI"/>
-          <w:color w:val="1A2634"/>
-          <w:sz w:val="21"/>
-          <w:szCs w:val="21"/>
-        </w:rPr>
-        <w:br/>
         <w:t>{/extra_sections}</w:t>
       </w:r>
     </w:p>
@@ -1295,18 +1185,30 @@
     </w:p>
     <w:p>
       <w:pPr>
-        <w:spacing w:after="60" w:line="22" w:lineRule="atLeast"/>
+        <w:spacing w:after="0" w:line="240" w:lineRule="auto"/>
         <w:rPr>
-          <w:rFonts w:cs="Segoe UI"/>
-          <w:color w:val="1A2634"/>
           <w:sz w:val="21"/>
           <w:szCs w:val="21"/>
         </w:rPr>
       </w:pPr>
       <w:r>
         <w:rPr>
-          <w:rFonts w:cs="Segoe UI"/>
-          <w:color w:val="1A2634"/>
+          <w:sz w:val="21"/>
+          <w:szCs w:val="21"/>
+        </w:rPr>
+        <w:t>{#REFERENCE_SECTION}</w:t>
+      </w:r>
+    </w:p>
+    <w:p>
+      <w:pPr>
+        <w:spacing w:after="0" w:line="240" w:lineRule="auto"/>
+        <w:rPr>
+          <w:sz w:val="21"/>
+          <w:szCs w:val="21"/>
+        </w:rPr>
+      </w:pPr>
+      <w:r>
+        <w:rPr>
           <w:sz w:val="21"/>
           <w:szCs w:val="21"/>
         </w:rPr>
@@ -1315,7 +1217,103 @@
     </w:p>
     <w:p>
       <w:pPr>
-        <w:spacing w:after="60" w:line="22" w:lineRule="atLeast"/>
+        <w:spacing w:after="0" w:line="240" w:lineRule="auto"/>
+        <w:rPr>
+          <w:sz w:val="21"/>
+          <w:szCs w:val="21"/>
+        </w:rPr>
+      </w:pPr>
+      <w:r>
+        <w:rPr>
+          <w:sz w:val="21"/>
+          <w:szCs w:val="21"/>
+        </w:rPr>
+        <w:t>{/REFERENCE_SECTION}</w:t>
+      </w:r>
+    </w:p>
+    <w:p>
+      <w:pPr>
+        <w:spacing w:after="0" w:line="240" w:lineRule="auto"/>
+        <w:rPr>
+          <w:sz w:val="21"/>
+          <w:szCs w:val="21"/>
+        </w:rPr>
+      </w:pPr>
+      <w:r>
+        <w:rPr>
+          <w:sz w:val="21"/>
+          <w:szCs w:val="21"/>
+        </w:rPr>
+        <w:t>{#references_list}</w:t>
+      </w:r>
+    </w:p>
+    <w:p>
+      <w:pPr>
+        <w:spacing w:after="0" w:line="240" w:lineRule="auto"/>
+        <w:rPr>
+          <w:sz w:val="21"/>
+          <w:szCs w:val="21"/>
+        </w:rPr>
+      </w:pPr>
+      <w:r>
+        <w:rPr>
+          <w:sz w:val="21"/>
+          <w:szCs w:val="21"/>
+        </w:rPr>
+        <w:t>{name}</w:t>
+      </w:r>
+    </w:p>
+    <w:p>
+      <w:pPr>
+        <w:spacing w:after="0" w:line="240" w:lineRule="auto"/>
+        <w:rPr>
+          <w:sz w:val="21"/>
+          <w:szCs w:val="21"/>
+        </w:rPr>
+      </w:pPr>
+      <w:r>
+        <w:rPr>
+          <w:sz w:val="21"/>
+          <w:szCs w:val="21"/>
+        </w:rPr>
+        <w:t>{position}, {organization}, {location}</w:t>
+      </w:r>
+    </w:p>
+    <w:p>
+      <w:pPr>
+        <w:spacing w:after="0" w:line="240" w:lineRule="auto"/>
+        <w:rPr>
+          <w:sz w:val="21"/>
+          <w:szCs w:val="21"/>
+        </w:rPr>
+      </w:pPr>
+      <w:r>
+        <w:rPr>
+          <w:sz w:val="21"/>
+          <w:szCs w:val="21"/>
+        </w:rPr>
+        <w:t>{email}, {phone}</w:t>
+      </w:r>
+    </w:p>
+    <w:p>
+      <w:pPr>
+        <w:spacing w:after="0" w:line="240" w:lineRule="auto"/>
+        <w:rPr>
+          <w:sz w:val="21"/>
+          <w:szCs w:val="21"/>
+        </w:rPr>
+      </w:pPr>
+      <w:r>
+        <w:rPr>
+          <w:sz w:val="21"/>
+          <w:szCs w:val="21"/>
+        </w:rPr>
+        <w:t>{/references_list}</w:t>
+      </w:r>
+    </w:p>
+    <w:p>
+      <w:pPr>
+        <w:spacing w:after="0" w:line="240" w:lineRule="auto"/>
         <w:rPr>
           <w:rFonts w:cs="Segoe UI"/>
           <w:color w:val="1A2634"/>
@@ -1324,55 +1322,12 @@
         </w:rPr>
       </w:pPr>
       <w:r>
-        <w:t>{#references_list}</w:t>
-      </w:r>
-      <w:r>
-        <w:br/>
-        <w:t>{name}</w:t>
-      </w:r>
-      <w:r>
-        <w:br/>
-        <w:t>{position}, {organization}, {location}</w:t>
-      </w:r>
-      <w:r>
-        <w:br/>
-        <w:t>{email}, {phone}</w:t>
-      </w:r>
-      <w:r>
-        <w:br/>
-        <w:t>{/references_list}</w:t>
-      </w:r>
-    </w:p>
-    <w:p>
-      <w:pPr>
-        <w:spacing w:after="60" w:line="22" w:lineRule="atLeast"/>
         <w:rPr>
-          <w:rFonts w:cs="Segoe UI"/>
-          <w:color w:val="1A2634"/>
-          <w:sz w:val="21"/>
-          <w:szCs w:val="21"/>
-        </w:rPr>
-      </w:pPr>
-      <w:r>
-        <w:rPr>
-          <w:rFonts w:cs="Segoe UI"/>
-          <w:color w:val="1A2634"/>
           <w:sz w:val="21"/>
           <w:szCs w:val="21"/>
         </w:rPr>
         <w:t>{/HAS_REFERENCE}</w:t>
       </w:r>
-    </w:p>
-    <w:p>
-      <w:pPr>
-        <w:spacing w:before="200" w:after="0" w:line="22" w:lineRule="atLeast"/>
-        <w:rPr>
-          <w:rFonts w:cs="Segoe UI"/>
-          <w:color w:val="1A2634"/>
-          <w:sz w:val="21"/>
-          <w:szCs w:val="21"/>
-        </w:rPr>
-      </w:pPr>
     </w:p>
     <w:sectPr>
       <w:pgSz w:w="11909" w:h="16834" w:code="9"/>
@@ -2026,7 +1981,7 @@
   <w:style w:type="paragraph" w:default="1" w:styleId="Normal">
     <w:name w:val="Normal"/>
     <w:qFormat/>
-    <w:rsid w:val="00D52D93"/>
+    <w:rsid w:val="004E691B"/>
     <w:rPr>
       <w:rFonts w:ascii="Segoe UI" w:hAnsi="Segoe UI"/>
     </w:rPr>
@@ -2243,7 +2198,6 @@
   <w:style w:type="character" w:default="1" w:styleId="DefaultParagraphFont">
     <w:name w:val="Default Paragraph Font"/>
     <w:uiPriority w:val="1"/>
-    <w:semiHidden/>
     <w:unhideWhenUsed/>
   </w:style>
   <w:style w:type="table" w:default="1" w:styleId="TableNormal">

</xml_diff>

<commit_message>
Add professional CV template selection and template health checks
</commit_message>
<xml_diff>
--- a/templates/template_professional.docx
+++ b/templates/template_professional.docx
@@ -4,6 +4,7 @@
   <w:body>
     <w:p>
       <w:pPr>
+        <w:spacing w:after="80"/>
         <w:rPr>
           <w:rFonts w:cs="Segoe UI"/>
           <w:b/>
@@ -180,7 +181,7 @@
         <w:pBdr>
           <w:bottom w:val="single" w:sz="8" w:space="1" w:color="auto"/>
         </w:pBdr>
-        <w:spacing w:after="0"/>
+        <w:spacing w:before="200" w:after="120"/>
         <w:rPr>
           <w:sz w:val="21"/>
           <w:szCs w:val="21"/>
@@ -191,7 +192,7 @@
           <w:sz w:val="21"/>
           <w:szCs w:val="21"/>
         </w:rPr>
-        <w:t>{#HAS_EDUCATION}</w:t>
+        <w:t>{#HAS_EXPERIENCE}</w:t>
       </w:r>
     </w:p>
     <w:p>
@@ -325,7 +326,67 @@
           <w:sz w:val="21"/>
           <w:szCs w:val="21"/>
         </w:rPr>
-        <w:t>{#start}{start}{/start}{#end_or_present} – {end_or_present}{/end_or_present}</w:t>
+        <w:t>{#</w:t>
+      </w:r>
+      <w:proofErr w:type="gramStart"/>
+      <w:r>
+        <w:rPr>
+          <w:rFonts w:cs="Segoe UI"/>
+          <w:color w:val="1A2634"/>
+          <w:sz w:val="21"/>
+          <w:szCs w:val="21"/>
+        </w:rPr>
+        <w:t>start}{</w:t>
+      </w:r>
+      <w:proofErr w:type="gramEnd"/>
+      <w:r>
+        <w:rPr>
+          <w:rFonts w:cs="Segoe UI"/>
+          <w:color w:val="1A2634"/>
+          <w:sz w:val="21"/>
+          <w:szCs w:val="21"/>
+        </w:rPr>
+        <w:t>start}{/start}{#end_or_present} – {</w:t>
+      </w:r>
+      <w:proofErr w:type="spellStart"/>
+      <w:r>
+        <w:rPr>
+          <w:rFonts w:cs="Segoe UI"/>
+          <w:color w:val="1A2634"/>
+          <w:sz w:val="21"/>
+          <w:szCs w:val="21"/>
+        </w:rPr>
+        <w:t>end_or_present</w:t>
+      </w:r>
+      <w:proofErr w:type="spellEnd"/>
+      <w:r>
+        <w:rPr>
+          <w:rFonts w:cs="Segoe UI"/>
+          <w:color w:val="1A2634"/>
+          <w:sz w:val="21"/>
+          <w:szCs w:val="21"/>
+        </w:rPr>
+        <w:t>}{/</w:t>
+      </w:r>
+      <w:proofErr w:type="spellStart"/>
+      <w:r>
+        <w:rPr>
+          <w:rFonts w:cs="Segoe UI"/>
+          <w:color w:val="1A2634"/>
+          <w:sz w:val="21"/>
+          <w:szCs w:val="21"/>
+        </w:rPr>
+        <w:t>end_or_present</w:t>
+      </w:r>
+      <w:proofErr w:type="spellEnd"/>
+      <w:r>
+        <w:rPr>
+          <w:rFonts w:cs="Segoe UI"/>
+          <w:color w:val="1A2634"/>
+          <w:sz w:val="21"/>
+          <w:szCs w:val="21"/>
+        </w:rPr>
+        <w:t>}</w:t>
       </w:r>
     </w:p>
     <w:p>
@@ -365,7 +426,27 @@
           <w:sz w:val="21"/>
           <w:szCs w:val="21"/>
         </w:rPr>
-        <w:t>{role_summary}</w:t>
+        <w:t>{</w:t>
+      </w:r>
+      <w:proofErr w:type="spellStart"/>
+      <w:r>
+        <w:rPr>
+          <w:rFonts w:cs="Segoe UI"/>
+          <w:color w:val="1A2634"/>
+          <w:sz w:val="21"/>
+          <w:szCs w:val="21"/>
+        </w:rPr>
+        <w:t>role_summary</w:t>
+      </w:r>
+      <w:proofErr w:type="spellEnd"/>
+      <w:r>
+        <w:rPr>
+          <w:rFonts w:cs="Segoe UI"/>
+          <w:color w:val="1A2634"/>
+          <w:sz w:val="21"/>
+          <w:szCs w:val="21"/>
+        </w:rPr>
+        <w:t>}</w:t>
       </w:r>
     </w:p>
     <w:p>
@@ -385,7 +466,27 @@
           <w:sz w:val="21"/>
           <w:szCs w:val="21"/>
         </w:rPr>
-        <w:t>{/role_summary}</w:t>
+        <w:t>{/</w:t>
+      </w:r>
+      <w:proofErr w:type="spellStart"/>
+      <w:r>
+        <w:rPr>
+          <w:rFonts w:cs="Segoe UI"/>
+          <w:color w:val="1A2634"/>
+          <w:sz w:val="21"/>
+          <w:szCs w:val="21"/>
+        </w:rPr>
+        <w:t>role_summary</w:t>
+      </w:r>
+      <w:proofErr w:type="spellEnd"/>
+      <w:r>
+        <w:rPr>
+          <w:rFonts w:cs="Segoe UI"/>
+          <w:color w:val="1A2634"/>
+          <w:sz w:val="21"/>
+          <w:szCs w:val="21"/>
+        </w:rPr>
+        <w:t>}</w:t>
       </w:r>
     </w:p>
     <w:p>
@@ -554,7 +655,31 @@
           <w:sz w:val="21"/>
           <w:szCs w:val="21"/>
         </w:rPr>
-        <w:t>{project_title}</w:t>
+        <w:t>{</w:t>
+      </w:r>
+      <w:proofErr w:type="spellStart"/>
+      <w:r>
+        <w:rPr>
+          <w:rFonts w:cs="Segoe UI"/>
+          <w:b/>
+          <w:bCs/>
+          <w:color w:val="1A2634"/>
+          <w:sz w:val="21"/>
+          <w:szCs w:val="21"/>
+        </w:rPr>
+        <w:t>project_title</w:t>
+      </w:r>
+      <w:proofErr w:type="spellEnd"/>
+      <w:r>
+        <w:rPr>
+          <w:rFonts w:cs="Segoe UI"/>
+          <w:b/>
+          <w:bCs/>
+          <w:color w:val="1A2634"/>
+          <w:sz w:val="21"/>
+          <w:szCs w:val="21"/>
+        </w:rPr>
+        <w:t>}</w:t>
       </w:r>
     </w:p>
     <w:p>
@@ -574,7 +699,67 @@
           <w:sz w:val="21"/>
           <w:szCs w:val="21"/>
         </w:rPr>
-        <w:t>{#start}{start}{/start}{#end_or_present} – {end_or_present}{/end_or_present}</w:t>
+        <w:t>{#</w:t>
+      </w:r>
+      <w:proofErr w:type="gramStart"/>
+      <w:r>
+        <w:rPr>
+          <w:rFonts w:cs="Segoe UI"/>
+          <w:color w:val="1A2634"/>
+          <w:sz w:val="21"/>
+          <w:szCs w:val="21"/>
+        </w:rPr>
+        <w:t>start}{</w:t>
+      </w:r>
+      <w:proofErr w:type="gramEnd"/>
+      <w:r>
+        <w:rPr>
+          <w:rFonts w:cs="Segoe UI"/>
+          <w:color w:val="1A2634"/>
+          <w:sz w:val="21"/>
+          <w:szCs w:val="21"/>
+        </w:rPr>
+        <w:t>start}{/start}{#end_or_present} – {</w:t>
+      </w:r>
+      <w:proofErr w:type="spellStart"/>
+      <w:r>
+        <w:rPr>
+          <w:rFonts w:cs="Segoe UI"/>
+          <w:color w:val="1A2634"/>
+          <w:sz w:val="21"/>
+          <w:szCs w:val="21"/>
+        </w:rPr>
+        <w:t>end_or_present</w:t>
+      </w:r>
+      <w:proofErr w:type="spellEnd"/>
+      <w:r>
+        <w:rPr>
+          <w:rFonts w:cs="Segoe UI"/>
+          <w:color w:val="1A2634"/>
+          <w:sz w:val="21"/>
+          <w:szCs w:val="21"/>
+        </w:rPr>
+        <w:t>}{/</w:t>
+      </w:r>
+      <w:proofErr w:type="spellStart"/>
+      <w:r>
+        <w:rPr>
+          <w:rFonts w:cs="Segoe UI"/>
+          <w:color w:val="1A2634"/>
+          <w:sz w:val="21"/>
+          <w:szCs w:val="21"/>
+        </w:rPr>
+        <w:t>end_or_present</w:t>
+      </w:r>
+      <w:proofErr w:type="spellEnd"/>
+      <w:r>
+        <w:rPr>
+          <w:rFonts w:cs="Segoe UI"/>
+          <w:color w:val="1A2634"/>
+          <w:sz w:val="21"/>
+          <w:szCs w:val="21"/>
+        </w:rPr>
+        <w:t>}</w:t>
       </w:r>
     </w:p>
     <w:p>
@@ -599,7 +784,7 @@
     </w:p>
     <w:p>
       <w:pPr>
-        <w:spacing w:after="0" w:line="22" w:lineRule="atLeast"/>
+        <w:spacing w:after="80" w:line="22" w:lineRule="atLeast"/>
         <w:rPr>
           <w:rFonts w:cs="Segoe UI"/>
           <w:color w:val="1A2634"/>
@@ -614,7 +799,27 @@
           <w:sz w:val="21"/>
           <w:szCs w:val="21"/>
         </w:rPr>
-        <w:t>{project_description}</w:t>
+        <w:t>{</w:t>
+      </w:r>
+      <w:proofErr w:type="spellStart"/>
+      <w:r>
+        <w:rPr>
+          <w:rFonts w:cs="Segoe UI"/>
+          <w:color w:val="1A2634"/>
+          <w:sz w:val="21"/>
+          <w:szCs w:val="21"/>
+        </w:rPr>
+        <w:t>project_description</w:t>
+      </w:r>
+      <w:proofErr w:type="spellEnd"/>
+      <w:r>
+        <w:rPr>
+          <w:rFonts w:cs="Segoe UI"/>
+          <w:color w:val="1A2634"/>
+          <w:sz w:val="21"/>
+          <w:szCs w:val="21"/>
+        </w:rPr>
+        <w:t>}</w:t>
       </w:r>
     </w:p>
     <w:p>
@@ -634,7 +839,27 @@
           <w:sz w:val="21"/>
           <w:szCs w:val="21"/>
         </w:rPr>
-        <w:t>{/project_description}</w:t>
+        <w:t>{/</w:t>
+      </w:r>
+      <w:proofErr w:type="spellStart"/>
+      <w:r>
+        <w:rPr>
+          <w:rFonts w:cs="Segoe UI"/>
+          <w:color w:val="1A2634"/>
+          <w:sz w:val="21"/>
+          <w:szCs w:val="21"/>
+        </w:rPr>
+        <w:t>project_description</w:t>
+      </w:r>
+      <w:proofErr w:type="spellEnd"/>
+      <w:r>
+        <w:rPr>
+          <w:rFonts w:cs="Segoe UI"/>
+          <w:color w:val="1A2634"/>
+          <w:sz w:val="21"/>
+          <w:szCs w:val="21"/>
+        </w:rPr>
+        <w:t>}</w:t>
       </w:r>
     </w:p>
     <w:p>
@@ -694,7 +919,27 @@
           <w:sz w:val="21"/>
           <w:szCs w:val="21"/>
         </w:rPr>
-        <w:t>{/project_tasks}</w:t>
+        <w:t>{/</w:t>
+      </w:r>
+      <w:proofErr w:type="spellStart"/>
+      <w:r>
+        <w:rPr>
+          <w:rFonts w:cs="Segoe UI"/>
+          <w:color w:val="1A2634"/>
+          <w:sz w:val="21"/>
+          <w:szCs w:val="21"/>
+        </w:rPr>
+        <w:t>project_tasks</w:t>
+      </w:r>
+      <w:proofErr w:type="spellEnd"/>
+      <w:r>
+        <w:rPr>
+          <w:rFonts w:cs="Segoe UI"/>
+          <w:color w:val="1A2634"/>
+          <w:sz w:val="21"/>
+          <w:szCs w:val="21"/>
+        </w:rPr>
+        <w:t>}</w:t>
       </w:r>
     </w:p>
     <w:p>
@@ -851,7 +1096,67 @@
           <w:sz w:val="21"/>
           <w:szCs w:val="21"/>
         </w:rPr>
-        <w:t>{#start}{start}{/start}{#end_or_present} – {end_or_present}{/end_or_present}</w:t>
+        <w:t>{#</w:t>
+      </w:r>
+      <w:proofErr w:type="gramStart"/>
+      <w:r>
+        <w:rPr>
+          <w:rFonts w:cs="Segoe UI"/>
+          <w:color w:val="1A2634"/>
+          <w:sz w:val="21"/>
+          <w:szCs w:val="21"/>
+        </w:rPr>
+        <w:t>start}{</w:t>
+      </w:r>
+      <w:proofErr w:type="gramEnd"/>
+      <w:r>
+        <w:rPr>
+          <w:rFonts w:cs="Segoe UI"/>
+          <w:color w:val="1A2634"/>
+          <w:sz w:val="21"/>
+          <w:szCs w:val="21"/>
+        </w:rPr>
+        <w:t>start}{/start}{#end_or_present} – {</w:t>
+      </w:r>
+      <w:proofErr w:type="spellStart"/>
+      <w:r>
+        <w:rPr>
+          <w:rFonts w:cs="Segoe UI"/>
+          <w:color w:val="1A2634"/>
+          <w:sz w:val="21"/>
+          <w:szCs w:val="21"/>
+        </w:rPr>
+        <w:t>end_or_present</w:t>
+      </w:r>
+      <w:proofErr w:type="spellEnd"/>
+      <w:r>
+        <w:rPr>
+          <w:rFonts w:cs="Segoe UI"/>
+          <w:color w:val="1A2634"/>
+          <w:sz w:val="21"/>
+          <w:szCs w:val="21"/>
+        </w:rPr>
+        <w:t>}{/</w:t>
+      </w:r>
+      <w:proofErr w:type="spellStart"/>
+      <w:r>
+        <w:rPr>
+          <w:rFonts w:cs="Segoe UI"/>
+          <w:color w:val="1A2634"/>
+          <w:sz w:val="21"/>
+          <w:szCs w:val="21"/>
+        </w:rPr>
+        <w:t>end_or_present</w:t>
+      </w:r>
+      <w:proofErr w:type="spellEnd"/>
+      <w:r>
+        <w:rPr>
+          <w:rFonts w:cs="Segoe UI"/>
+          <w:color w:val="1A2634"/>
+          <w:sz w:val="21"/>
+          <w:szCs w:val="21"/>
+        </w:rPr>
+        <w:t>}</w:t>
       </w:r>
     </w:p>
     <w:p>
@@ -1043,17 +1348,41 @@
           <w:szCs w:val="21"/>
         </w:rPr>
         <w:br/>
-        <w:t>{#section_title}</w:t>
       </w:r>
       <w:r>
         <w:rPr>
           <w:rFonts w:cs="Segoe UI"/>
+          <w:b/>
+          <w:bCs/>
           <w:color w:val="1A2634"/>
           <w:sz w:val="21"/>
           <w:szCs w:val="21"/>
         </w:rPr>
-        <w:br/>
-        <w:t>{section_title}</w:t>
+        <w:t>{</w:t>
+      </w:r>
+      <w:proofErr w:type="spellStart"/>
+      <w:r>
+        <w:rPr>
+          <w:rFonts w:cs="Segoe UI"/>
+          <w:b/>
+          <w:bCs/>
+          <w:color w:val="1A2634"/>
+          <w:sz w:val="21"/>
+          <w:szCs w:val="21"/>
+        </w:rPr>
+        <w:t>section_title</w:t>
+      </w:r>
+      <w:proofErr w:type="spellEnd"/>
+      <w:r>
+        <w:rPr>
+          <w:rFonts w:cs="Segoe UI"/>
+          <w:b/>
+          <w:bCs/>
+          <w:color w:val="1A2634"/>
+          <w:sz w:val="21"/>
+          <w:szCs w:val="21"/>
+        </w:rPr>
+        <w:t>}</w:t>
       </w:r>
       <w:r>
         <w:rPr>
@@ -1063,7 +1392,27 @@
           <w:szCs w:val="21"/>
         </w:rPr>
         <w:br/>
-        <w:t>{/section_title}</w:t>
+        <w:t>{/</w:t>
+      </w:r>
+      <w:proofErr w:type="spellStart"/>
+      <w:r>
+        <w:rPr>
+          <w:rFonts w:cs="Segoe UI"/>
+          <w:color w:val="1A2634"/>
+          <w:sz w:val="21"/>
+          <w:szCs w:val="21"/>
+        </w:rPr>
+        <w:t>section_title</w:t>
+      </w:r>
+      <w:proofErr w:type="spellEnd"/>
+      <w:r>
+        <w:rPr>
+          <w:rFonts w:cs="Segoe UI"/>
+          <w:color w:val="1A2634"/>
+          <w:sz w:val="21"/>
+          <w:szCs w:val="21"/>
+        </w:rPr>
+        <w:t>}</w:t>
       </w:r>
       <w:r>
         <w:rPr>
@@ -1113,7 +1462,27 @@
           <w:szCs w:val="21"/>
         </w:rPr>
         <w:br/>
-        <w:t>{section_content}</w:t>
+        <w:t>{</w:t>
+      </w:r>
+      <w:proofErr w:type="spellStart"/>
+      <w:r>
+        <w:rPr>
+          <w:rFonts w:cs="Segoe UI"/>
+          <w:color w:val="1A2634"/>
+          <w:sz w:val="21"/>
+          <w:szCs w:val="21"/>
+        </w:rPr>
+        <w:t>section_content</w:t>
+      </w:r>
+      <w:proofErr w:type="spellEnd"/>
+      <w:r>
+        <w:rPr>
+          <w:rFonts w:cs="Segoe UI"/>
+          <w:color w:val="1A2634"/>
+          <w:sz w:val="21"/>
+          <w:szCs w:val="21"/>
+        </w:rPr>
+        <w:t>}</w:t>
       </w:r>
       <w:r>
         <w:rPr>
@@ -1123,7 +1492,27 @@
           <w:szCs w:val="21"/>
         </w:rPr>
         <w:br/>
-        <w:t>{/section_content}</w:t>
+        <w:t>{/</w:t>
+      </w:r>
+      <w:proofErr w:type="spellStart"/>
+      <w:r>
+        <w:rPr>
+          <w:rFonts w:cs="Segoe UI"/>
+          <w:color w:val="1A2634"/>
+          <w:sz w:val="21"/>
+          <w:szCs w:val="21"/>
+        </w:rPr>
+        <w:t>section_content</w:t>
+      </w:r>
+      <w:proofErr w:type="spellEnd"/>
+      <w:r>
+        <w:rPr>
+          <w:rFonts w:cs="Segoe UI"/>
+          <w:color w:val="1A2634"/>
+          <w:sz w:val="21"/>
+          <w:szCs w:val="21"/>
+        </w:rPr>
+        <w:t>}</w:t>
       </w:r>
       <w:r>
         <w:rPr>
@@ -1133,7 +1522,27 @@
           <w:szCs w:val="21"/>
         </w:rPr>
         <w:br/>
-        <w:t>{/extra_sections}</w:t>
+        <w:t>{/</w:t>
+      </w:r>
+      <w:proofErr w:type="spellStart"/>
+      <w:r>
+        <w:rPr>
+          <w:rFonts w:cs="Segoe UI"/>
+          <w:color w:val="1A2634"/>
+          <w:sz w:val="21"/>
+          <w:szCs w:val="21"/>
+        </w:rPr>
+        <w:t>extra_sections</w:t>
+      </w:r>
+      <w:proofErr w:type="spellEnd"/>
+      <w:r>
+        <w:rPr>
+          <w:rFonts w:cs="Segoe UI"/>
+          <w:color w:val="1A2634"/>
+          <w:sz w:val="21"/>
+          <w:szCs w:val="21"/>
+        </w:rPr>
+        <w:t>}</w:t>
       </w:r>
     </w:p>
     <w:p>
@@ -1185,7 +1594,7 @@
     </w:p>
     <w:p>
       <w:pPr>
-        <w:spacing w:after="0" w:line="240" w:lineRule="auto"/>
+        <w:spacing w:after="0" w:line="22" w:lineRule="atLeast"/>
         <w:rPr>
           <w:sz w:val="21"/>
           <w:szCs w:val="21"/>
@@ -1196,12 +1605,73 @@
           <w:sz w:val="21"/>
           <w:szCs w:val="21"/>
         </w:rPr>
-        <w:t>{#REFERENCE_SECTION}</w:t>
+        <w:t>{#HAS_REFERENCES_LIST}</w:t>
+      </w:r>
+      <w:r>
+        <w:rPr>
+          <w:sz w:val="21"/>
+          <w:szCs w:val="21"/>
+        </w:rPr>
+        <w:br/>
+        <w:t>{#references_list}</w:t>
+      </w:r>
+      <w:r>
+        <w:rPr>
+          <w:sz w:val="21"/>
+          <w:szCs w:val="21"/>
+        </w:rPr>
+        <w:br/>
+      </w:r>
+      <w:r>
+        <w:rPr>
+          <w:b/>
+          <w:bCs/>
+          <w:sz w:val="21"/>
+          <w:szCs w:val="21"/>
+        </w:rPr>
+        <w:t>{name}</w:t>
+      </w:r>
+      <w:r>
+        <w:rPr>
+          <w:sz w:val="21"/>
+          <w:szCs w:val="21"/>
+        </w:rPr>
+        <w:t>, {position}</w:t>
+      </w:r>
+      <w:r>
+        <w:rPr>
+          <w:sz w:val="21"/>
+          <w:szCs w:val="21"/>
+        </w:rPr>
+        <w:br/>
+        <w:t>{organization}, {location}</w:t>
+      </w:r>
+      <w:r>
+        <w:rPr>
+          <w:sz w:val="21"/>
+          <w:szCs w:val="21"/>
+        </w:rPr>
+        <w:br/>
+      </w:r>
+      <w:r>
+        <w:rPr>
+          <w:color w:val="0070C0"/>
+          <w:sz w:val="21"/>
+          <w:szCs w:val="21"/>
+        </w:rPr>
+        <w:t>{email}</w:t>
+      </w:r>
+      <w:r>
+        <w:rPr>
+          <w:sz w:val="21"/>
+          <w:szCs w:val="21"/>
+        </w:rPr>
+        <w:t>, {phone}</w:t>
       </w:r>
     </w:p>
     <w:p>
       <w:pPr>
-        <w:spacing w:after="0" w:line="240" w:lineRule="auto"/>
+        <w:spacing w:after="0" w:line="22" w:lineRule="atLeast"/>
         <w:rPr>
           <w:sz w:val="21"/>
           <w:szCs w:val="21"/>
@@ -1212,12 +1682,36 @@
           <w:sz w:val="21"/>
           <w:szCs w:val="21"/>
         </w:rPr>
-        <w:t>{REFERENCE_SECTION}</w:t>
+        <w:t>{/</w:t>
+      </w:r>
+      <w:proofErr w:type="spellStart"/>
+      <w:r>
+        <w:rPr>
+          <w:sz w:val="21"/>
+          <w:szCs w:val="21"/>
+        </w:rPr>
+        <w:t>references_list</w:t>
+      </w:r>
+      <w:proofErr w:type="spellEnd"/>
+      <w:r>
+        <w:rPr>
+          <w:sz w:val="21"/>
+          <w:szCs w:val="21"/>
+        </w:rPr>
+        <w:t>}</w:t>
+      </w:r>
+      <w:r>
+        <w:rPr>
+          <w:sz w:val="21"/>
+          <w:szCs w:val="21"/>
+        </w:rPr>
+        <w:br/>
+        <w:t>{/HAS_REFERENCES_LIST}</w:t>
       </w:r>
     </w:p>
     <w:p>
       <w:pPr>
-        <w:spacing w:after="0" w:line="240" w:lineRule="auto"/>
+        <w:spacing w:after="0" w:line="22" w:lineRule="atLeast"/>
         <w:rPr>
           <w:sz w:val="21"/>
           <w:szCs w:val="21"/>
@@ -1228,95 +1722,29 @@
           <w:sz w:val="21"/>
           <w:szCs w:val="21"/>
         </w:rPr>
-        <w:t>{/REFERENCE_SECTION}</w:t>
+        <w:t>{^HAS_REFERENCES_LIST}</w:t>
+      </w:r>
+      <w:r>
+        <w:rPr>
+          <w:sz w:val="21"/>
+          <w:szCs w:val="21"/>
+        </w:rPr>
+        <w:br/>
+        <w:t>{REFERENCE_SECTION}</w:t>
+      </w:r>
+      <w:r>
+        <w:rPr>
+          <w:sz w:val="21"/>
+          <w:szCs w:val="21"/>
+        </w:rPr>
+        <w:br/>
+        <w:t>{/HAS_REFERENCES_LIST}</w:t>
       </w:r>
     </w:p>
     <w:p>
       <w:pPr>
-        <w:spacing w:after="0" w:line="240" w:lineRule="auto"/>
-        <w:rPr>
-          <w:sz w:val="21"/>
-          <w:szCs w:val="21"/>
-        </w:rPr>
-      </w:pPr>
-      <w:r>
-        <w:rPr>
-          <w:sz w:val="21"/>
-          <w:szCs w:val="21"/>
-        </w:rPr>
-        <w:t>{#references_list}</w:t>
-      </w:r>
-    </w:p>
-    <w:p>
-      <w:pPr>
-        <w:spacing w:after="0" w:line="240" w:lineRule="auto"/>
-        <w:rPr>
-          <w:sz w:val="21"/>
-          <w:szCs w:val="21"/>
-        </w:rPr>
-      </w:pPr>
-      <w:r>
-        <w:rPr>
-          <w:sz w:val="21"/>
-          <w:szCs w:val="21"/>
-        </w:rPr>
-        <w:t>{name}</w:t>
-      </w:r>
-    </w:p>
-    <w:p>
-      <w:pPr>
-        <w:spacing w:after="0" w:line="240" w:lineRule="auto"/>
-        <w:rPr>
-          <w:sz w:val="21"/>
-          <w:szCs w:val="21"/>
-        </w:rPr>
-      </w:pPr>
-      <w:r>
-        <w:rPr>
-          <w:sz w:val="21"/>
-          <w:szCs w:val="21"/>
-        </w:rPr>
-        <w:t>{position}, {organization}, {location}</w:t>
-      </w:r>
-    </w:p>
-    <w:p>
-      <w:pPr>
-        <w:spacing w:after="0" w:line="240" w:lineRule="auto"/>
-        <w:rPr>
-          <w:sz w:val="21"/>
-          <w:szCs w:val="21"/>
-        </w:rPr>
-      </w:pPr>
-      <w:r>
-        <w:rPr>
-          <w:sz w:val="21"/>
-          <w:szCs w:val="21"/>
-        </w:rPr>
-        <w:t>{email}, {phone}</w:t>
-      </w:r>
-    </w:p>
-    <w:p>
-      <w:pPr>
-        <w:spacing w:after="0" w:line="240" w:lineRule="auto"/>
-        <w:rPr>
-          <w:sz w:val="21"/>
-          <w:szCs w:val="21"/>
-        </w:rPr>
-      </w:pPr>
-      <w:r>
-        <w:rPr>
-          <w:sz w:val="21"/>
-          <w:szCs w:val="21"/>
-        </w:rPr>
-        <w:t>{/references_list}</w:t>
-      </w:r>
-    </w:p>
-    <w:p>
-      <w:pPr>
-        <w:spacing w:after="0" w:line="240" w:lineRule="auto"/>
-        <w:rPr>
-          <w:rFonts w:cs="Segoe UI"/>
-          <w:color w:val="1A2634"/>
+        <w:spacing w:after="0" w:line="22" w:lineRule="atLeast"/>
+        <w:rPr>
           <w:sz w:val="21"/>
           <w:szCs w:val="21"/>
         </w:rPr>
@@ -2198,6 +2626,7 @@
   <w:style w:type="character" w:default="1" w:styleId="DefaultParagraphFont">
     <w:name w:val="Default Paragraph Font"/>
     <w:uiPriority w:val="1"/>
+    <w:semiHidden/>
     <w:unhideWhenUsed/>
   </w:style>
   <w:style w:type="table" w:default="1" w:styleId="TableNormal">

</xml_diff>

<commit_message>
Fix reference section extraction from uploaded CVs
</commit_message>
<xml_diff>
--- a/templates/template_professional.docx
+++ b/templates/template_professional.docx
@@ -326,67 +326,7 @@
           <w:sz w:val="21"/>
           <w:szCs w:val="21"/>
         </w:rPr>
-        <w:t>{#</w:t>
-      </w:r>
-      <w:proofErr w:type="gramStart"/>
-      <w:r>
-        <w:rPr>
-          <w:rFonts w:cs="Segoe UI"/>
-          <w:color w:val="1A2634"/>
-          <w:sz w:val="21"/>
-          <w:szCs w:val="21"/>
-        </w:rPr>
-        <w:t>start}{</w:t>
-      </w:r>
-      <w:proofErr w:type="gramEnd"/>
-      <w:r>
-        <w:rPr>
-          <w:rFonts w:cs="Segoe UI"/>
-          <w:color w:val="1A2634"/>
-          <w:sz w:val="21"/>
-          <w:szCs w:val="21"/>
-        </w:rPr>
-        <w:t>start}{/start}{#end_or_present} – {</w:t>
-      </w:r>
-      <w:proofErr w:type="spellStart"/>
-      <w:r>
-        <w:rPr>
-          <w:rFonts w:cs="Segoe UI"/>
-          <w:color w:val="1A2634"/>
-          <w:sz w:val="21"/>
-          <w:szCs w:val="21"/>
-        </w:rPr>
-        <w:t>end_or_present</w:t>
-      </w:r>
-      <w:proofErr w:type="spellEnd"/>
-      <w:r>
-        <w:rPr>
-          <w:rFonts w:cs="Segoe UI"/>
-          <w:color w:val="1A2634"/>
-          <w:sz w:val="21"/>
-          <w:szCs w:val="21"/>
-        </w:rPr>
-        <w:t>}{/</w:t>
-      </w:r>
-      <w:proofErr w:type="spellStart"/>
-      <w:r>
-        <w:rPr>
-          <w:rFonts w:cs="Segoe UI"/>
-          <w:color w:val="1A2634"/>
-          <w:sz w:val="21"/>
-          <w:szCs w:val="21"/>
-        </w:rPr>
-        <w:t>end_or_present</w:t>
-      </w:r>
-      <w:proofErr w:type="spellEnd"/>
-      <w:r>
-        <w:rPr>
-          <w:rFonts w:cs="Segoe UI"/>
-          <w:color w:val="1A2634"/>
-          <w:sz w:val="21"/>
-          <w:szCs w:val="21"/>
-        </w:rPr>
-        <w:t>}</w:t>
+        <w:t>{#start}{start}{/start}{#start}{#end_or_present} – {/end_or_present}{/start}{#end_or_present}{end_or_present}{/end_or_present}</w:t>
       </w:r>
     </w:p>
     <w:p>
@@ -699,67 +639,7 @@
           <w:sz w:val="21"/>
           <w:szCs w:val="21"/>
         </w:rPr>
-        <w:t>{#</w:t>
-      </w:r>
-      <w:proofErr w:type="gramStart"/>
-      <w:r>
-        <w:rPr>
-          <w:rFonts w:cs="Segoe UI"/>
-          <w:color w:val="1A2634"/>
-          <w:sz w:val="21"/>
-          <w:szCs w:val="21"/>
-        </w:rPr>
-        <w:t>start}{</w:t>
-      </w:r>
-      <w:proofErr w:type="gramEnd"/>
-      <w:r>
-        <w:rPr>
-          <w:rFonts w:cs="Segoe UI"/>
-          <w:color w:val="1A2634"/>
-          <w:sz w:val="21"/>
-          <w:szCs w:val="21"/>
-        </w:rPr>
-        <w:t>start}{/start}{#end_or_present} – {</w:t>
-      </w:r>
-      <w:proofErr w:type="spellStart"/>
-      <w:r>
-        <w:rPr>
-          <w:rFonts w:cs="Segoe UI"/>
-          <w:color w:val="1A2634"/>
-          <w:sz w:val="21"/>
-          <w:szCs w:val="21"/>
-        </w:rPr>
-        <w:t>end_or_present</w:t>
-      </w:r>
-      <w:proofErr w:type="spellEnd"/>
-      <w:r>
-        <w:rPr>
-          <w:rFonts w:cs="Segoe UI"/>
-          <w:color w:val="1A2634"/>
-          <w:sz w:val="21"/>
-          <w:szCs w:val="21"/>
-        </w:rPr>
-        <w:t>}{/</w:t>
-      </w:r>
-      <w:proofErr w:type="spellStart"/>
-      <w:r>
-        <w:rPr>
-          <w:rFonts w:cs="Segoe UI"/>
-          <w:color w:val="1A2634"/>
-          <w:sz w:val="21"/>
-          <w:szCs w:val="21"/>
-        </w:rPr>
-        <w:t>end_or_present</w:t>
-      </w:r>
-      <w:proofErr w:type="spellEnd"/>
-      <w:r>
-        <w:rPr>
-          <w:rFonts w:cs="Segoe UI"/>
-          <w:color w:val="1A2634"/>
-          <w:sz w:val="21"/>
-          <w:szCs w:val="21"/>
-        </w:rPr>
-        <w:t>}</w:t>
+        <w:t>{#start}{start}{/start}{#start}{#end_or_present} – {/end_or_present}{/start}{#end_or_present}{end_or_present}{/end_or_present}</w:t>
       </w:r>
     </w:p>
     <w:p>
@@ -1013,6 +893,7 @@
           <w:sz w:val="21"/>
           <w:szCs w:val="21"/>
         </w:rPr>
+        <w:lastRenderedPageBreak/>
         <w:t>{/HAS_EDUCATION}</w:t>
       </w:r>
     </w:p>
@@ -1021,7 +902,6 @@
         <w:spacing w:after="0" w:line="22" w:lineRule="atLeast"/>
       </w:pPr>
       <w:r>
-        <w:lastRenderedPageBreak/>
         <w:t>{#education}</w:t>
       </w:r>
     </w:p>
@@ -1096,67 +976,7 @@
           <w:sz w:val="21"/>
           <w:szCs w:val="21"/>
         </w:rPr>
-        <w:t>{#</w:t>
-      </w:r>
-      <w:proofErr w:type="gramStart"/>
-      <w:r>
-        <w:rPr>
-          <w:rFonts w:cs="Segoe UI"/>
-          <w:color w:val="1A2634"/>
-          <w:sz w:val="21"/>
-          <w:szCs w:val="21"/>
-        </w:rPr>
-        <w:t>start}{</w:t>
-      </w:r>
-      <w:proofErr w:type="gramEnd"/>
-      <w:r>
-        <w:rPr>
-          <w:rFonts w:cs="Segoe UI"/>
-          <w:color w:val="1A2634"/>
-          <w:sz w:val="21"/>
-          <w:szCs w:val="21"/>
-        </w:rPr>
-        <w:t>start}{/start}{#end_or_present} – {</w:t>
-      </w:r>
-      <w:proofErr w:type="spellStart"/>
-      <w:r>
-        <w:rPr>
-          <w:rFonts w:cs="Segoe UI"/>
-          <w:color w:val="1A2634"/>
-          <w:sz w:val="21"/>
-          <w:szCs w:val="21"/>
-        </w:rPr>
-        <w:t>end_or_present</w:t>
-      </w:r>
-      <w:proofErr w:type="spellEnd"/>
-      <w:r>
-        <w:rPr>
-          <w:rFonts w:cs="Segoe UI"/>
-          <w:color w:val="1A2634"/>
-          <w:sz w:val="21"/>
-          <w:szCs w:val="21"/>
-        </w:rPr>
-        <w:t>}{/</w:t>
-      </w:r>
-      <w:proofErr w:type="spellStart"/>
-      <w:r>
-        <w:rPr>
-          <w:rFonts w:cs="Segoe UI"/>
-          <w:color w:val="1A2634"/>
-          <w:sz w:val="21"/>
-          <w:szCs w:val="21"/>
-        </w:rPr>
-        <w:t>end_or_present</w:t>
-      </w:r>
-      <w:proofErr w:type="spellEnd"/>
-      <w:r>
-        <w:rPr>
-          <w:rFonts w:cs="Segoe UI"/>
-          <w:color w:val="1A2634"/>
-          <w:sz w:val="21"/>
-          <w:szCs w:val="21"/>
-        </w:rPr>
-        <w:t>}</w:t>
+        <w:t>{#start}{start}{/start}{#start}{#end_or_present} – {/end_or_present}{/start}{#end_or_present}{end_or_present}{/end_or_present}</w:t>
       </w:r>
     </w:p>
     <w:p>

</xml_diff>

<commit_message>
Update template selection and Professional template
</commit_message>
<xml_diff>
--- a/templates/template_professional.docx
+++ b/templates/template_professional.docx
@@ -547,318 +547,9 @@
           <w:sz w:val="24"/>
           <w:szCs w:val="24"/>
         </w:rPr>
-        <w:t>PROJECTS</w:t>
+        <w:t xml:space="preserve">KEY </w:t>
       </w:r>
-    </w:p>
-    <w:p>
-      <w:pPr>
-        <w:spacing w:after="0" w:line="22" w:lineRule="atLeast"/>
-      </w:pPr>
       <w:r>
-        <w:t>{/HAS_PROJECTS}</w:t>
-      </w:r>
-    </w:p>
-    <w:p>
-      <w:pPr>
-        <w:spacing w:after="0" w:line="22" w:lineRule="atLeast"/>
-        <w:rPr>
-          <w:sz w:val="21"/>
-          <w:szCs w:val="21"/>
-        </w:rPr>
-      </w:pPr>
-      <w:r>
-        <w:rPr>
-          <w:sz w:val="21"/>
-          <w:szCs w:val="21"/>
-        </w:rPr>
-        <w:t>{#projects}</w:t>
-      </w:r>
-    </w:p>
-    <w:p>
-      <w:pPr>
-        <w:spacing w:after="0" w:line="22" w:lineRule="atLeast"/>
-        <w:rPr>
-          <w:rFonts w:cs="Segoe UI"/>
-          <w:b/>
-          <w:bCs/>
-          <w:color w:val="1A2634"/>
-          <w:sz w:val="21"/>
-          <w:szCs w:val="21"/>
-        </w:rPr>
-      </w:pPr>
-      <w:r>
-        <w:rPr>
-          <w:rFonts w:cs="Segoe UI"/>
-          <w:b/>
-          <w:bCs/>
-          <w:color w:val="1A2634"/>
-          <w:sz w:val="21"/>
-          <w:szCs w:val="21"/>
-        </w:rPr>
-        <w:t>{</w:t>
-      </w:r>
-      <w:proofErr w:type="spellStart"/>
-      <w:r>
-        <w:rPr>
-          <w:rFonts w:cs="Segoe UI"/>
-          <w:b/>
-          <w:bCs/>
-          <w:color w:val="1A2634"/>
-          <w:sz w:val="21"/>
-          <w:szCs w:val="21"/>
-        </w:rPr>
-        <w:t>project_title</w:t>
-      </w:r>
-      <w:proofErr w:type="spellEnd"/>
-      <w:r>
-        <w:rPr>
-          <w:rFonts w:cs="Segoe UI"/>
-          <w:b/>
-          <w:bCs/>
-          <w:color w:val="1A2634"/>
-          <w:sz w:val="21"/>
-          <w:szCs w:val="21"/>
-        </w:rPr>
-        <w:t>}</w:t>
-      </w:r>
-    </w:p>
-    <w:p>
-      <w:pPr>
-        <w:spacing w:after="0" w:line="22" w:lineRule="atLeast"/>
-        <w:rPr>
-          <w:rFonts w:cs="Segoe UI"/>
-          <w:color w:val="1A2634"/>
-          <w:sz w:val="21"/>
-          <w:szCs w:val="21"/>
-        </w:rPr>
-      </w:pPr>
-      <w:r>
-        <w:rPr>
-          <w:rFonts w:cs="Segoe UI"/>
-          <w:color w:val="1A2634"/>
-          <w:sz w:val="21"/>
-          <w:szCs w:val="21"/>
-        </w:rPr>
-        <w:t>{#start}{start}{/start}{#start}{#end_or_present} – {/end_or_present}{/start}{#end_or_present}{end_or_present}{/end_or_present}</w:t>
-      </w:r>
-    </w:p>
-    <w:p>
-      <w:pPr>
-        <w:spacing w:after="0" w:line="22" w:lineRule="atLeast"/>
-        <w:rPr>
-          <w:rFonts w:cs="Segoe UI"/>
-          <w:color w:val="1A2634"/>
-          <w:sz w:val="21"/>
-          <w:szCs w:val="21"/>
-        </w:rPr>
-      </w:pPr>
-      <w:r>
-        <w:rPr>
-          <w:rFonts w:cs="Segoe UI"/>
-          <w:color w:val="1A2634"/>
-          <w:sz w:val="21"/>
-          <w:szCs w:val="21"/>
-        </w:rPr>
-        <w:t>{#project_description}</w:t>
-      </w:r>
-    </w:p>
-    <w:p>
-      <w:pPr>
-        <w:spacing w:after="80" w:line="22" w:lineRule="atLeast"/>
-        <w:rPr>
-          <w:rFonts w:cs="Segoe UI"/>
-          <w:color w:val="1A2634"/>
-          <w:sz w:val="21"/>
-          <w:szCs w:val="21"/>
-        </w:rPr>
-      </w:pPr>
-      <w:r>
-        <w:rPr>
-          <w:rFonts w:cs="Segoe UI"/>
-          <w:color w:val="1A2634"/>
-          <w:sz w:val="21"/>
-          <w:szCs w:val="21"/>
-        </w:rPr>
-        <w:t>{</w:t>
-      </w:r>
-      <w:proofErr w:type="spellStart"/>
-      <w:r>
-        <w:rPr>
-          <w:rFonts w:cs="Segoe UI"/>
-          <w:color w:val="1A2634"/>
-          <w:sz w:val="21"/>
-          <w:szCs w:val="21"/>
-        </w:rPr>
-        <w:t>project_description</w:t>
-      </w:r>
-      <w:proofErr w:type="spellEnd"/>
-      <w:r>
-        <w:rPr>
-          <w:rFonts w:cs="Segoe UI"/>
-          <w:color w:val="1A2634"/>
-          <w:sz w:val="21"/>
-          <w:szCs w:val="21"/>
-        </w:rPr>
-        <w:t>}</w:t>
-      </w:r>
-    </w:p>
-    <w:p>
-      <w:pPr>
-        <w:spacing w:after="0" w:line="22" w:lineRule="atLeast"/>
-        <w:rPr>
-          <w:rFonts w:cs="Segoe UI"/>
-          <w:color w:val="1A2634"/>
-          <w:sz w:val="21"/>
-          <w:szCs w:val="21"/>
-        </w:rPr>
-      </w:pPr>
-      <w:r>
-        <w:rPr>
-          <w:rFonts w:cs="Segoe UI"/>
-          <w:color w:val="1A2634"/>
-          <w:sz w:val="21"/>
-          <w:szCs w:val="21"/>
-        </w:rPr>
-        <w:t>{/</w:t>
-      </w:r>
-      <w:proofErr w:type="spellStart"/>
-      <w:r>
-        <w:rPr>
-          <w:rFonts w:cs="Segoe UI"/>
-          <w:color w:val="1A2634"/>
-          <w:sz w:val="21"/>
-          <w:szCs w:val="21"/>
-        </w:rPr>
-        <w:t>project_description</w:t>
-      </w:r>
-      <w:proofErr w:type="spellEnd"/>
-      <w:r>
-        <w:rPr>
-          <w:rFonts w:cs="Segoe UI"/>
-          <w:color w:val="1A2634"/>
-          <w:sz w:val="21"/>
-          <w:szCs w:val="21"/>
-        </w:rPr>
-        <w:t>}</w:t>
-      </w:r>
-    </w:p>
-    <w:p>
-      <w:pPr>
-        <w:spacing w:after="0" w:line="22" w:lineRule="atLeast"/>
-        <w:rPr>
-          <w:rFonts w:cs="Segoe UI"/>
-          <w:color w:val="1A2634"/>
-          <w:sz w:val="21"/>
-          <w:szCs w:val="21"/>
-        </w:rPr>
-      </w:pPr>
-      <w:r>
-        <w:rPr>
-          <w:rFonts w:cs="Segoe UI"/>
-          <w:color w:val="1A2634"/>
-          <w:sz w:val="21"/>
-          <w:szCs w:val="21"/>
-        </w:rPr>
-        <w:t>{#project_tasks}</w:t>
-      </w:r>
-    </w:p>
-    <w:p>
-      <w:pPr>
-        <w:spacing w:after="0" w:line="22" w:lineRule="atLeast"/>
-        <w:rPr>
-          <w:rFonts w:cs="Segoe UI"/>
-          <w:color w:val="1A2634"/>
-          <w:sz w:val="21"/>
-          <w:szCs w:val="21"/>
-        </w:rPr>
-      </w:pPr>
-      <w:r>
-        <w:rPr>
-          <w:rFonts w:cs="Segoe UI"/>
-          <w:color w:val="1A2634"/>
-          <w:sz w:val="21"/>
-          <w:szCs w:val="21"/>
-        </w:rPr>
-        <w:t>• {.}</w:t>
-      </w:r>
-    </w:p>
-    <w:p>
-      <w:pPr>
-        <w:spacing w:after="0" w:line="22" w:lineRule="atLeast"/>
-        <w:rPr>
-          <w:rFonts w:cs="Segoe UI"/>
-          <w:color w:val="1A2634"/>
-          <w:sz w:val="21"/>
-          <w:szCs w:val="21"/>
-        </w:rPr>
-      </w:pPr>
-      <w:r>
-        <w:rPr>
-          <w:rFonts w:cs="Segoe UI"/>
-          <w:color w:val="1A2634"/>
-          <w:sz w:val="21"/>
-          <w:szCs w:val="21"/>
-        </w:rPr>
-        <w:t>{/</w:t>
-      </w:r>
-      <w:proofErr w:type="spellStart"/>
-      <w:r>
-        <w:rPr>
-          <w:rFonts w:cs="Segoe UI"/>
-          <w:color w:val="1A2634"/>
-          <w:sz w:val="21"/>
-          <w:szCs w:val="21"/>
-        </w:rPr>
-        <w:t>project_tasks</w:t>
-      </w:r>
-      <w:proofErr w:type="spellEnd"/>
-      <w:r>
-        <w:rPr>
-          <w:rFonts w:cs="Segoe UI"/>
-          <w:color w:val="1A2634"/>
-          <w:sz w:val="21"/>
-          <w:szCs w:val="21"/>
-        </w:rPr>
-        <w:t>}</w:t>
-      </w:r>
-    </w:p>
-    <w:p>
-      <w:pPr>
-        <w:spacing w:after="0" w:line="22" w:lineRule="atLeast"/>
-        <w:rPr>
-          <w:rFonts w:cs="Segoe UI"/>
-          <w:color w:val="1A2634"/>
-          <w:sz w:val="21"/>
-          <w:szCs w:val="21"/>
-        </w:rPr>
-      </w:pPr>
-      <w:r>
-        <w:rPr>
-          <w:rFonts w:cs="Segoe UI"/>
-          <w:color w:val="1A2634"/>
-          <w:sz w:val="21"/>
-          <w:szCs w:val="21"/>
-        </w:rPr>
-        <w:t>{/projects}</w:t>
-      </w:r>
-    </w:p>
-    <w:p>
-      <w:pPr>
-        <w:pBdr>
-          <w:bottom w:val="single" w:sz="8" w:space="1" w:color="auto"/>
-        </w:pBdr>
-        <w:spacing w:before="200" w:after="120"/>
-      </w:pPr>
-      <w:r>
-        <w:t>{#HAS_EDUCATION}</w:t>
-      </w:r>
-    </w:p>
-    <w:p>
-      <w:pPr>
-        <w:pBdr>
-          <w:bottom w:val="single" w:sz="8" w:space="1" w:color="auto"/>
-        </w:pBdr>
-        <w:spacing w:before="200" w:after="120"/>
         <w:rPr>
           <w:rFonts w:cs="Segoe UI"/>
           <w:b/>
@@ -867,8 +558,318 @@
           <w:sz w:val="24"/>
           <w:szCs w:val="24"/>
         </w:rPr>
+        <w:t>PROJECTS</w:t>
+      </w:r>
+    </w:p>
+    <w:p>
+      <w:pPr>
+        <w:spacing w:after="0" w:line="22" w:lineRule="atLeast"/>
       </w:pPr>
       <w:r>
+        <w:t>{/HAS_PROJECTS}</w:t>
+      </w:r>
+    </w:p>
+    <w:p>
+      <w:pPr>
+        <w:spacing w:after="0" w:line="22" w:lineRule="atLeast"/>
+        <w:rPr>
+          <w:sz w:val="21"/>
+          <w:szCs w:val="21"/>
+        </w:rPr>
+      </w:pPr>
+      <w:r>
+        <w:rPr>
+          <w:sz w:val="21"/>
+          <w:szCs w:val="21"/>
+        </w:rPr>
+        <w:t>{#projects}</w:t>
+      </w:r>
+    </w:p>
+    <w:p>
+      <w:pPr>
+        <w:spacing w:after="0" w:line="22" w:lineRule="atLeast"/>
+        <w:rPr>
+          <w:rFonts w:cs="Segoe UI"/>
+          <w:b/>
+          <w:bCs/>
+          <w:color w:val="1A2634"/>
+          <w:sz w:val="21"/>
+          <w:szCs w:val="21"/>
+        </w:rPr>
+      </w:pPr>
+      <w:r>
+        <w:rPr>
+          <w:rFonts w:cs="Segoe UI"/>
+          <w:b/>
+          <w:bCs/>
+          <w:color w:val="1A2634"/>
+          <w:sz w:val="21"/>
+          <w:szCs w:val="21"/>
+        </w:rPr>
+        <w:t>{</w:t>
+      </w:r>
+      <w:proofErr w:type="spellStart"/>
+      <w:r>
+        <w:rPr>
+          <w:rFonts w:cs="Segoe UI"/>
+          <w:b/>
+          <w:bCs/>
+          <w:color w:val="1A2634"/>
+          <w:sz w:val="21"/>
+          <w:szCs w:val="21"/>
+        </w:rPr>
+        <w:t>project_title</w:t>
+      </w:r>
+      <w:proofErr w:type="spellEnd"/>
+      <w:r>
+        <w:rPr>
+          <w:rFonts w:cs="Segoe UI"/>
+          <w:b/>
+          <w:bCs/>
+          <w:color w:val="1A2634"/>
+          <w:sz w:val="21"/>
+          <w:szCs w:val="21"/>
+        </w:rPr>
+        <w:t>}</w:t>
+      </w:r>
+    </w:p>
+    <w:p>
+      <w:pPr>
+        <w:spacing w:after="0" w:line="22" w:lineRule="atLeast"/>
+        <w:rPr>
+          <w:rFonts w:cs="Segoe UI"/>
+          <w:color w:val="1A2634"/>
+          <w:sz w:val="21"/>
+          <w:szCs w:val="21"/>
+        </w:rPr>
+      </w:pPr>
+      <w:r>
+        <w:rPr>
+          <w:rFonts w:cs="Segoe UI"/>
+          <w:color w:val="1A2634"/>
+          <w:sz w:val="21"/>
+          <w:szCs w:val="21"/>
+        </w:rPr>
+        <w:t>{#start}{start}{/start}{#start}{#end_or_present} – {/end_or_present}{/start}{#end_or_present}{end_or_present}{/end_or_present}</w:t>
+      </w:r>
+    </w:p>
+    <w:p>
+      <w:pPr>
+        <w:spacing w:after="0" w:line="22" w:lineRule="atLeast"/>
+        <w:rPr>
+          <w:rFonts w:cs="Segoe UI"/>
+          <w:color w:val="1A2634"/>
+          <w:sz w:val="21"/>
+          <w:szCs w:val="21"/>
+        </w:rPr>
+      </w:pPr>
+      <w:r>
+        <w:rPr>
+          <w:rFonts w:cs="Segoe UI"/>
+          <w:color w:val="1A2634"/>
+          <w:sz w:val="21"/>
+          <w:szCs w:val="21"/>
+        </w:rPr>
+        <w:t>{#project_description}</w:t>
+      </w:r>
+    </w:p>
+    <w:p>
+      <w:pPr>
+        <w:spacing w:after="80" w:line="22" w:lineRule="atLeast"/>
+        <w:rPr>
+          <w:rFonts w:cs="Segoe UI"/>
+          <w:color w:val="1A2634"/>
+          <w:sz w:val="21"/>
+          <w:szCs w:val="21"/>
+        </w:rPr>
+      </w:pPr>
+      <w:r>
+        <w:rPr>
+          <w:rFonts w:cs="Segoe UI"/>
+          <w:color w:val="1A2634"/>
+          <w:sz w:val="21"/>
+          <w:szCs w:val="21"/>
+        </w:rPr>
+        <w:t>{</w:t>
+      </w:r>
+      <w:proofErr w:type="spellStart"/>
+      <w:r>
+        <w:rPr>
+          <w:rFonts w:cs="Segoe UI"/>
+          <w:color w:val="1A2634"/>
+          <w:sz w:val="21"/>
+          <w:szCs w:val="21"/>
+        </w:rPr>
+        <w:t>project_description</w:t>
+      </w:r>
+      <w:proofErr w:type="spellEnd"/>
+      <w:r>
+        <w:rPr>
+          <w:rFonts w:cs="Segoe UI"/>
+          <w:color w:val="1A2634"/>
+          <w:sz w:val="21"/>
+          <w:szCs w:val="21"/>
+        </w:rPr>
+        <w:t>}</w:t>
+      </w:r>
+    </w:p>
+    <w:p>
+      <w:pPr>
+        <w:spacing w:after="0" w:line="22" w:lineRule="atLeast"/>
+        <w:rPr>
+          <w:rFonts w:cs="Segoe UI"/>
+          <w:color w:val="1A2634"/>
+          <w:sz w:val="21"/>
+          <w:szCs w:val="21"/>
+        </w:rPr>
+      </w:pPr>
+      <w:r>
+        <w:rPr>
+          <w:rFonts w:cs="Segoe UI"/>
+          <w:color w:val="1A2634"/>
+          <w:sz w:val="21"/>
+          <w:szCs w:val="21"/>
+        </w:rPr>
+        <w:t>{/</w:t>
+      </w:r>
+      <w:proofErr w:type="spellStart"/>
+      <w:r>
+        <w:rPr>
+          <w:rFonts w:cs="Segoe UI"/>
+          <w:color w:val="1A2634"/>
+          <w:sz w:val="21"/>
+          <w:szCs w:val="21"/>
+        </w:rPr>
+        <w:t>project_description</w:t>
+      </w:r>
+      <w:proofErr w:type="spellEnd"/>
+      <w:r>
+        <w:rPr>
+          <w:rFonts w:cs="Segoe UI"/>
+          <w:color w:val="1A2634"/>
+          <w:sz w:val="21"/>
+          <w:szCs w:val="21"/>
+        </w:rPr>
+        <w:t>}</w:t>
+      </w:r>
+    </w:p>
+    <w:p>
+      <w:pPr>
+        <w:spacing w:after="0" w:line="22" w:lineRule="atLeast"/>
+        <w:rPr>
+          <w:rFonts w:cs="Segoe UI"/>
+          <w:color w:val="1A2634"/>
+          <w:sz w:val="21"/>
+          <w:szCs w:val="21"/>
+        </w:rPr>
+      </w:pPr>
+      <w:r>
+        <w:rPr>
+          <w:rFonts w:cs="Segoe UI"/>
+          <w:color w:val="1A2634"/>
+          <w:sz w:val="21"/>
+          <w:szCs w:val="21"/>
+        </w:rPr>
+        <w:t>{#project_tasks}</w:t>
+      </w:r>
+    </w:p>
+    <w:p>
+      <w:pPr>
+        <w:spacing w:after="0" w:line="22" w:lineRule="atLeast"/>
+        <w:rPr>
+          <w:rFonts w:cs="Segoe UI"/>
+          <w:color w:val="1A2634"/>
+          <w:sz w:val="21"/>
+          <w:szCs w:val="21"/>
+        </w:rPr>
+      </w:pPr>
+      <w:r>
+        <w:rPr>
+          <w:rFonts w:cs="Segoe UI"/>
+          <w:color w:val="1A2634"/>
+          <w:sz w:val="21"/>
+          <w:szCs w:val="21"/>
+        </w:rPr>
+        <w:t>• {.}</w:t>
+      </w:r>
+    </w:p>
+    <w:p>
+      <w:pPr>
+        <w:spacing w:after="0" w:line="22" w:lineRule="atLeast"/>
+        <w:rPr>
+          <w:rFonts w:cs="Segoe UI"/>
+          <w:color w:val="1A2634"/>
+          <w:sz w:val="21"/>
+          <w:szCs w:val="21"/>
+        </w:rPr>
+      </w:pPr>
+      <w:r>
+        <w:rPr>
+          <w:rFonts w:cs="Segoe UI"/>
+          <w:color w:val="1A2634"/>
+          <w:sz w:val="21"/>
+          <w:szCs w:val="21"/>
+        </w:rPr>
+        <w:t>{/</w:t>
+      </w:r>
+      <w:proofErr w:type="spellStart"/>
+      <w:r>
+        <w:rPr>
+          <w:rFonts w:cs="Segoe UI"/>
+          <w:color w:val="1A2634"/>
+          <w:sz w:val="21"/>
+          <w:szCs w:val="21"/>
+        </w:rPr>
+        <w:t>project_tasks</w:t>
+      </w:r>
+      <w:proofErr w:type="spellEnd"/>
+      <w:r>
+        <w:rPr>
+          <w:rFonts w:cs="Segoe UI"/>
+          <w:color w:val="1A2634"/>
+          <w:sz w:val="21"/>
+          <w:szCs w:val="21"/>
+        </w:rPr>
+        <w:t>}</w:t>
+      </w:r>
+    </w:p>
+    <w:p>
+      <w:pPr>
+        <w:spacing w:after="0" w:line="22" w:lineRule="atLeast"/>
+        <w:rPr>
+          <w:rFonts w:cs="Segoe UI"/>
+          <w:color w:val="1A2634"/>
+          <w:sz w:val="21"/>
+          <w:szCs w:val="21"/>
+        </w:rPr>
+      </w:pPr>
+      <w:r>
+        <w:rPr>
+          <w:rFonts w:cs="Segoe UI"/>
+          <w:color w:val="1A2634"/>
+          <w:sz w:val="21"/>
+          <w:szCs w:val="21"/>
+        </w:rPr>
+        <w:t>{/projects}</w:t>
+      </w:r>
+    </w:p>
+    <w:p>
+      <w:pPr>
+        <w:pBdr>
+          <w:bottom w:val="single" w:sz="8" w:space="1" w:color="auto"/>
+        </w:pBdr>
+        <w:spacing w:before="200" w:after="120"/>
+      </w:pPr>
+      <w:r>
+        <w:t>{#HAS_EDUCATION}</w:t>
+      </w:r>
+    </w:p>
+    <w:p>
+      <w:pPr>
+        <w:pBdr>
+          <w:bottom w:val="single" w:sz="8" w:space="1" w:color="auto"/>
+        </w:pBdr>
+        <w:spacing w:before="200" w:after="120"/>
         <w:rPr>
           <w:rFonts w:cs="Segoe UI"/>
           <w:b/>
@@ -877,148 +878,8 @@
           <w:sz w:val="24"/>
           <w:szCs w:val="24"/>
         </w:rPr>
-        <w:t>EDUCATION</w:t>
-      </w:r>
-    </w:p>
-    <w:p>
-      <w:pPr>
-        <w:spacing w:after="0" w:line="22" w:lineRule="atLeast"/>
-        <w:rPr>
-          <w:sz w:val="21"/>
-          <w:szCs w:val="21"/>
-        </w:rPr>
       </w:pPr>
       <w:r>
-        <w:rPr>
-          <w:sz w:val="21"/>
-          <w:szCs w:val="21"/>
-        </w:rPr>
-        <w:lastRenderedPageBreak/>
-        <w:t>{/HAS_EDUCATION}</w:t>
-      </w:r>
-    </w:p>
-    <w:p>
-      <w:pPr>
-        <w:spacing w:after="0" w:line="22" w:lineRule="atLeast"/>
-      </w:pPr>
-      <w:r>
-        <w:t>{#education}</w:t>
-      </w:r>
-    </w:p>
-    <w:p>
-      <w:pPr>
-        <w:spacing w:after="0" w:line="22" w:lineRule="atLeast"/>
-        <w:rPr>
-          <w:rFonts w:cs="Segoe UI"/>
-          <w:color w:val="1A2634"/>
-          <w:sz w:val="21"/>
-          <w:szCs w:val="21"/>
-        </w:rPr>
-      </w:pPr>
-      <w:r>
-        <w:rPr>
-          <w:rFonts w:cs="Segoe UI"/>
-          <w:color w:val="1A2634"/>
-          <w:sz w:val="21"/>
-          <w:szCs w:val="21"/>
-        </w:rPr>
-        <w:t>{degree}</w:t>
-      </w:r>
-    </w:p>
-    <w:p>
-      <w:pPr>
-        <w:spacing w:after="0" w:line="22" w:lineRule="atLeast"/>
-        <w:rPr>
-          <w:rFonts w:cs="Segoe UI"/>
-          <w:color w:val="1A2634"/>
-          <w:sz w:val="21"/>
-          <w:szCs w:val="21"/>
-        </w:rPr>
-      </w:pPr>
-      <w:r>
-        <w:rPr>
-          <w:rFonts w:cs="Segoe UI"/>
-          <w:b/>
-          <w:bCs/>
-          <w:color w:val="1A2634"/>
-          <w:sz w:val="21"/>
-          <w:szCs w:val="21"/>
-        </w:rPr>
-        <w:t>{school}</w:t>
-      </w:r>
-      <w:r>
-        <w:rPr>
-          <w:rFonts w:cs="Segoe UI"/>
-          <w:color w:val="1A2634"/>
-          <w:sz w:val="21"/>
-          <w:szCs w:val="21"/>
-        </w:rPr>
-        <w:t>{#location} | {location}{/location}</w:t>
-      </w:r>
-    </w:p>
-    <w:p>
-      <w:pPr>
-        <w:pBdr>
-          <w:bottom w:val="single" w:sz="8" w:space="1" w:color="auto"/>
-        </w:pBdr>
-        <w:spacing w:after="120"/>
-        <w:rPr>
-          <w:rFonts w:cs="Segoe UI"/>
-          <w:color w:val="1A2634"/>
-          <w:sz w:val="21"/>
-          <w:szCs w:val="21"/>
-        </w:rPr>
-      </w:pPr>
-      <w:r>
-        <w:rPr>
-          <w:rFonts w:cs="Segoe UI"/>
-          <w:color w:val="1A2634"/>
-          <w:sz w:val="21"/>
-          <w:szCs w:val="21"/>
-        </w:rPr>
-        <w:t>{#start}{start}{/start}{#start}{#end_or_present} – {/end_or_present}{/start}{#end_or_present}{end_or_present}{/end_or_present}</w:t>
-      </w:r>
-    </w:p>
-    <w:p>
-      <w:pPr>
-        <w:pBdr>
-          <w:bottom w:val="single" w:sz="8" w:space="1" w:color="auto"/>
-        </w:pBdr>
-        <w:spacing w:after="120"/>
-        <w:rPr>
-          <w:rFonts w:cs="Segoe UI"/>
-          <w:color w:val="1A2634"/>
-          <w:sz w:val="21"/>
-          <w:szCs w:val="21"/>
-        </w:rPr>
-      </w:pPr>
-      <w:r>
-        <w:rPr>
-          <w:rFonts w:cs="Segoe UI"/>
-          <w:color w:val="1A2634"/>
-          <w:sz w:val="21"/>
-          <w:szCs w:val="21"/>
-        </w:rPr>
-        <w:t>{/education}</w:t>
-      </w:r>
-    </w:p>
-    <w:p>
-      <w:pPr>
-        <w:pBdr>
-          <w:bottom w:val="single" w:sz="8" w:space="1" w:color="auto"/>
-        </w:pBdr>
-        <w:spacing w:before="200" w:after="120"/>
-      </w:pPr>
-      <w:r>
-        <w:t>{#HAS_CERTIFICATIONS}</w:t>
-      </w:r>
-    </w:p>
-    <w:p>
-      <w:pPr>
-        <w:pBdr>
-          <w:bottom w:val="single" w:sz="8" w:space="1" w:color="auto"/>
-        </w:pBdr>
-        <w:spacing w:before="200" w:after="120"/>
         <w:rPr>
           <w:rFonts w:cs="Segoe UI"/>
           <w:b/>
@@ -1027,8 +888,148 @@
           <w:sz w:val="24"/>
           <w:szCs w:val="24"/>
         </w:rPr>
+        <w:t>EDUCATION</w:t>
+      </w:r>
+    </w:p>
+    <w:p>
+      <w:pPr>
+        <w:spacing w:after="0" w:line="22" w:lineRule="atLeast"/>
+        <w:rPr>
+          <w:sz w:val="21"/>
+          <w:szCs w:val="21"/>
+        </w:rPr>
       </w:pPr>
       <w:r>
+        <w:rPr>
+          <w:sz w:val="21"/>
+          <w:szCs w:val="21"/>
+        </w:rPr>
+        <w:lastRenderedPageBreak/>
+        <w:t>{/HAS_EDUCATION}</w:t>
+      </w:r>
+    </w:p>
+    <w:p>
+      <w:pPr>
+        <w:spacing w:after="0" w:line="22" w:lineRule="atLeast"/>
+      </w:pPr>
+      <w:r>
+        <w:t>{#education}</w:t>
+      </w:r>
+    </w:p>
+    <w:p>
+      <w:pPr>
+        <w:spacing w:after="0" w:line="22" w:lineRule="atLeast"/>
+        <w:rPr>
+          <w:rFonts w:cs="Segoe UI"/>
+          <w:color w:val="1A2634"/>
+          <w:sz w:val="21"/>
+          <w:szCs w:val="21"/>
+        </w:rPr>
+      </w:pPr>
+      <w:r>
+        <w:rPr>
+          <w:rFonts w:cs="Segoe UI"/>
+          <w:color w:val="1A2634"/>
+          <w:sz w:val="21"/>
+          <w:szCs w:val="21"/>
+        </w:rPr>
+        <w:t>{degree}</w:t>
+      </w:r>
+    </w:p>
+    <w:p>
+      <w:pPr>
+        <w:spacing w:after="0" w:line="22" w:lineRule="atLeast"/>
+        <w:rPr>
+          <w:rFonts w:cs="Segoe UI"/>
+          <w:color w:val="1A2634"/>
+          <w:sz w:val="21"/>
+          <w:szCs w:val="21"/>
+        </w:rPr>
+      </w:pPr>
+      <w:r>
+        <w:rPr>
+          <w:rFonts w:cs="Segoe UI"/>
+          <w:b/>
+          <w:bCs/>
+          <w:color w:val="1A2634"/>
+          <w:sz w:val="21"/>
+          <w:szCs w:val="21"/>
+        </w:rPr>
+        <w:t>{school}</w:t>
+      </w:r>
+      <w:r>
+        <w:rPr>
+          <w:rFonts w:cs="Segoe UI"/>
+          <w:color w:val="1A2634"/>
+          <w:sz w:val="21"/>
+          <w:szCs w:val="21"/>
+        </w:rPr>
+        <w:t>{#location} | {location}{/location}</w:t>
+      </w:r>
+    </w:p>
+    <w:p>
+      <w:pPr>
+        <w:pBdr>
+          <w:bottom w:val="single" w:sz="8" w:space="1" w:color="auto"/>
+        </w:pBdr>
+        <w:spacing w:after="120"/>
+        <w:rPr>
+          <w:rFonts w:cs="Segoe UI"/>
+          <w:color w:val="1A2634"/>
+          <w:sz w:val="21"/>
+          <w:szCs w:val="21"/>
+        </w:rPr>
+      </w:pPr>
+      <w:r>
+        <w:rPr>
+          <w:rFonts w:cs="Segoe UI"/>
+          <w:color w:val="1A2634"/>
+          <w:sz w:val="21"/>
+          <w:szCs w:val="21"/>
+        </w:rPr>
+        <w:t>{#start}{start}{/start}{#start}{#end_or_present} – {/end_or_present}{/start}{#end_or_present}{end_or_present}{/end_or_present}</w:t>
+      </w:r>
+    </w:p>
+    <w:p>
+      <w:pPr>
+        <w:pBdr>
+          <w:bottom w:val="single" w:sz="8" w:space="1" w:color="auto"/>
+        </w:pBdr>
+        <w:spacing w:after="120"/>
+        <w:rPr>
+          <w:rFonts w:cs="Segoe UI"/>
+          <w:color w:val="1A2634"/>
+          <w:sz w:val="21"/>
+          <w:szCs w:val="21"/>
+        </w:rPr>
+      </w:pPr>
+      <w:r>
+        <w:rPr>
+          <w:rFonts w:cs="Segoe UI"/>
+          <w:color w:val="1A2634"/>
+          <w:sz w:val="21"/>
+          <w:szCs w:val="21"/>
+        </w:rPr>
+        <w:t>{/education}</w:t>
+      </w:r>
+    </w:p>
+    <w:p>
+      <w:pPr>
+        <w:pBdr>
+          <w:bottom w:val="single" w:sz="8" w:space="1" w:color="auto"/>
+        </w:pBdr>
+        <w:spacing w:before="200" w:after="120"/>
+      </w:pPr>
+      <w:r>
+        <w:t>{#HAS_CERTIFICATIONS}</w:t>
+      </w:r>
+    </w:p>
+    <w:p>
+      <w:pPr>
+        <w:pBdr>
+          <w:bottom w:val="single" w:sz="8" w:space="1" w:color="auto"/>
+        </w:pBdr>
+        <w:spacing w:before="200" w:after="120"/>
         <w:rPr>
           <w:rFonts w:cs="Segoe UI"/>
           <w:b/>
@@ -1037,102 +1038,8 @@
           <w:sz w:val="24"/>
           <w:szCs w:val="24"/>
         </w:rPr>
-        <w:t>CERTIFICATIONS</w:t>
-      </w:r>
-    </w:p>
-    <w:p>
-      <w:pPr>
-        <w:spacing w:after="0" w:line="22" w:lineRule="atLeast"/>
-        <w:rPr>
-          <w:sz w:val="21"/>
-          <w:szCs w:val="21"/>
-        </w:rPr>
       </w:pPr>
       <w:r>
-        <w:rPr>
-          <w:sz w:val="21"/>
-          <w:szCs w:val="21"/>
-        </w:rPr>
-        <w:t>{/HAS_CERTIFICATIONS}</w:t>
-      </w:r>
-    </w:p>
-    <w:p>
-      <w:pPr>
-        <w:spacing w:after="0" w:line="22" w:lineRule="atLeast"/>
-        <w:rPr>
-          <w:sz w:val="21"/>
-          <w:szCs w:val="21"/>
-        </w:rPr>
-      </w:pPr>
-      <w:r>
-        <w:rPr>
-          <w:sz w:val="21"/>
-          <w:szCs w:val="21"/>
-        </w:rPr>
-        <w:t>{#certifications}</w:t>
-      </w:r>
-    </w:p>
-    <w:p>
-      <w:pPr>
-        <w:spacing w:after="0" w:line="22" w:lineRule="atLeast"/>
-        <w:rPr>
-          <w:sz w:val="21"/>
-          <w:szCs w:val="21"/>
-        </w:rPr>
-      </w:pPr>
-      <w:r>
-        <w:rPr>
-          <w:sz w:val="21"/>
-          <w:szCs w:val="21"/>
-        </w:rPr>
-        <w:t>• {.}</w:t>
-      </w:r>
-    </w:p>
-    <w:p>
-      <w:pPr>
-        <w:spacing w:after="0" w:line="22" w:lineRule="atLeast"/>
-        <w:rPr>
-          <w:rFonts w:cs="Segoe UI"/>
-          <w:color w:val="1A2634"/>
-          <w:sz w:val="21"/>
-          <w:szCs w:val="21"/>
-        </w:rPr>
-      </w:pPr>
-      <w:r>
-        <w:rPr>
-          <w:rFonts w:cs="Segoe UI"/>
-          <w:color w:val="1A2634"/>
-          <w:sz w:val="21"/>
-          <w:szCs w:val="21"/>
-        </w:rPr>
-        <w:t>{/certifications}</w:t>
-      </w:r>
-    </w:p>
-    <w:p>
-      <w:pPr>
-        <w:pBdr>
-          <w:bottom w:val="single" w:sz="8" w:space="1" w:color="auto"/>
-        </w:pBdr>
-        <w:spacing w:after="0"/>
-        <w:rPr>
-          <w:sz w:val="21"/>
-          <w:szCs w:val="21"/>
-        </w:rPr>
-      </w:pPr>
-      <w:r>
-        <w:rPr>
-          <w:sz w:val="21"/>
-          <w:szCs w:val="21"/>
-        </w:rPr>
-        <w:t>{#HAS_EXTRA}</w:t>
-      </w:r>
-    </w:p>
-    <w:p>
-      <w:pPr>
-        <w:pBdr>
-          <w:bottom w:val="single" w:sz="8" w:space="1" w:color="auto"/>
-        </w:pBdr>
-        <w:spacing w:before="200" w:after="120"/>
         <w:rPr>
           <w:rFonts w:cs="Segoe UI"/>
           <w:b/>
@@ -1141,30 +1048,80 @@
           <w:sz w:val="24"/>
           <w:szCs w:val="24"/>
         </w:rPr>
-      </w:pPr>
-      <w:r>
-        <w:rPr>
-          <w:rFonts w:cs="Segoe UI"/>
-          <w:b/>
-          <w:bCs/>
-          <w:color w:val="1A2634"/>
-          <w:sz w:val="24"/>
-          <w:szCs w:val="24"/>
-        </w:rPr>
-        <w:t>ADDITIONAL INFORMATION</w:t>
+        <w:t>CERTIFICATIONS, TRAINING &amp; LICENSES</w:t>
       </w:r>
     </w:p>
     <w:p>
       <w:pPr>
         <w:spacing w:after="0" w:line="22" w:lineRule="atLeast"/>
+        <w:rPr>
+          <w:sz w:val="21"/>
+          <w:szCs w:val="21"/>
+        </w:rPr>
       </w:pPr>
       <w:r>
-        <w:t>{/HAS_EXTRA}</w:t>
+        <w:rPr>
+          <w:sz w:val="21"/>
+          <w:szCs w:val="21"/>
+        </w:rPr>
+        <w:t>{/HAS_CERTIFICATIONS}</w:t>
       </w:r>
     </w:p>
     <w:p>
       <w:pPr>
         <w:spacing w:after="0" w:line="22" w:lineRule="atLeast"/>
+        <w:rPr>
+          <w:sz w:val="21"/>
+          <w:szCs w:val="21"/>
+        </w:rPr>
+      </w:pPr>
+      <w:r>
+        <w:rPr>
+          <w:sz w:val="21"/>
+          <w:szCs w:val="21"/>
+        </w:rPr>
+        <w:t>{#certifications}</w:t>
+      </w:r>
+    </w:p>
+    <w:p>
+      <w:pPr>
+        <w:spacing w:after="0" w:line="22" w:lineRule="atLeast"/>
+        <w:rPr>
+          <w:sz w:val="21"/>
+          <w:szCs w:val="21"/>
+        </w:rPr>
+      </w:pPr>
+      <w:r>
+        <w:rPr>
+          <w:sz w:val="21"/>
+          <w:szCs w:val="21"/>
+        </w:rPr>
+        <w:t>• {.}</w:t>
+      </w:r>
+    </w:p>
+    <w:p>
+      <w:pPr>
+        <w:spacing w:after="0" w:line="22" w:lineRule="atLeast"/>
+        <w:rPr>
+          <w:rFonts w:cs="Segoe UI"/>
+          <w:color w:val="1A2634"/>
+          <w:sz w:val="21"/>
+          <w:szCs w:val="21"/>
+        </w:rPr>
+      </w:pPr>
+      <w:r>
+        <w:rPr>
+          <w:rFonts w:cs="Segoe UI"/>
+          <w:color w:val="1A2634"/>
+          <w:sz w:val="21"/>
+          <w:szCs w:val="21"/>
+        </w:rPr>
+        <w:t>{/certifications}</w:t>
+      </w:r>
+    </w:p>
+    <w:p>
+      <w:pPr>
+        <w:spacing w:before="200" w:after="0" w:line="22" w:lineRule="atLeast"/>
         <w:rPr>
           <w:rFonts w:cs="Segoe UI"/>
           <w:color w:val="1A2634"/>
@@ -1184,7 +1141,10 @@
     </w:p>
     <w:p>
       <w:pPr>
-        <w:spacing w:after="0" w:line="22" w:lineRule="atLeast"/>
+        <w:pBdr>
+          <w:bottom w:val="single" w:sz="4" w:space="1" w:color="auto"/>
+        </w:pBdr>
+        <w:spacing w:before="200" w:after="80" w:line="22" w:lineRule="atLeast"/>
         <w:rPr>
           <w:rFonts w:cs="Segoe UI"/>
           <w:b/>

</xml_diff>